<commit_message>
Deploying to gh-pages from @ Morrison-Lab/mcs@4f1d435295e5b9c009df3cb6ddd9314793e3029a 🚀
</commit_message>
<xml_diff>
--- a/chapters/functional-programming.docx
+++ b/chapters/functional-programming.docx
@@ -23,7 +23,7 @@
         <w:pStyle w:val="Date"/>
       </w:pPr>
       <w:r>
-        <w:t xml:space="preserve">Last modified: 2026-10-29 13:30:08 (PDT)</w:t>
+        <w:t xml:space="preserve">Last modified: 2026-10-29 13:50:37 (PDT)</w:t>
       </w:r>
     </w:p>
     <w:tbl>
@@ -6600,60 +6600,1634 @@
     </w:p>
     <w:bookmarkEnd w:id="47"/>
     <w:bookmarkEnd w:id="48"/>
-    <w:bookmarkStart w:id="60" w:name="references"/>
+    <w:bookmarkStart w:id="56" w:name="sec-lambda-let"/>
     <w:p>
       <w:pPr>
         <w:pStyle w:val="Heading1"/>
       </w:pPr>
       <w:r>
-        <w:t xml:space="preserve">References</w:t>
-      </w:r>
-    </w:p>
-    <w:bookmarkStart w:id="59" w:name="refs"/>
-    <w:bookmarkStart w:id="50" w:name="ref-wikipedia_expression_mathematics"/>
-    <w:p>
-      <w:pPr>
-        <w:pStyle w:val="Bibliography"/>
-      </w:pPr>
-      <w:r>
-        <w:t xml:space="preserve">Wikipedia contributors. 2026a.</w:t>
-      </w:r>
-      <w:r>
-        <w:t xml:space="preserve"> </w:t>
-      </w:r>
+        <w:t xml:space="preserve">6. Anonymous functions</w:t>
+      </w:r>
+    </w:p>
+    <w:bookmarkStart w:id="49" w:name="exr-pair-with"/>
+    <w:p>
+      <w:pPr>
+        <w:pStyle w:val="FirstParagraph"/>
+      </w:pPr>
+      <w:r>
+        <w:rPr>
+          <w:b/>
+          <w:bCs/>
+        </w:rPr>
+        <w:t xml:space="preserve">Exercise 6 (A function with no name)</w:t>
+      </w:r>
+      <w:r>
+        <w:t xml:space="preserve"> </w:t>
+      </w:r>
+      <w:r>
+        <w:t xml:space="preserve">The function</w:t>
+      </w:r>
+      <w:r>
+        <w:t xml:space="preserve"> </w:t>
+      </w:r>
+      <w:r>
+        <w:rPr>
+          <w:rStyle w:val="VerbatimChar"/>
+        </w:rPr>
+        <w:t xml:space="preserve">pair-with</w:t>
+      </w:r>
+      <w:r>
+        <w:t xml:space="preserve"> </w:t>
+      </w:r>
+      <w:r>
+        <w:t xml:space="preserve">takes a list</w:t>
+      </w:r>
+      <w:r>
+        <w:t xml:space="preserve"> </w:t>
+      </w:r>
+      <w:r>
+        <w:rPr>
+          <w:rStyle w:val="VerbatimChar"/>
+        </w:rPr>
+        <w:t xml:space="preserve">L</w:t>
+      </w:r>
+      <w:r>
+        <w:t xml:space="preserve"> </w:t>
+      </w:r>
+      <w:r>
+        <w:t xml:space="preserve">and a value</w:t>
+      </w:r>
+      <w:r>
+        <w:t xml:space="preserve"> </w:t>
+      </w:r>
+      <w:r>
+        <w:rPr>
+          <w:rStyle w:val="VerbatimChar"/>
+        </w:rPr>
+        <w:t xml:space="preserve">y</w:t>
+      </w:r>
+      <w:r>
+        <w:t xml:space="preserve">:</w:t>
+      </w:r>
+    </w:p>
+    <w:p>
+      <w:pPr>
+        <w:pStyle w:val="SourceCode"/>
+      </w:pPr>
+      <w:r>
+        <w:rPr>
+          <w:rStyle w:val="OperatorTok"/>
+        </w:rPr>
+        <w:t xml:space="preserve">(</w:t>
+      </w:r>
+      <w:r>
+        <w:rPr>
+          <w:rStyle w:val="ExtensionTok"/>
+        </w:rPr>
+        <w:t xml:space="preserve">define</w:t>
+      </w:r>
+      <w:r>
+        <w:rPr>
+          <w:rStyle w:val="FunctionTok"/>
+        </w:rPr>
+        <w:t xml:space="preserve"> </w:t>
+      </w:r>
+      <w:r>
+        <w:rPr>
+          <w:rStyle w:val="OperatorTok"/>
+        </w:rPr>
+        <w:t xml:space="preserve">(</w:t>
+      </w:r>
+      <w:r>
+        <w:rPr>
+          <w:rStyle w:val="NormalTok"/>
+        </w:rPr>
+        <w:t xml:space="preserve">pair-with L y</w:t>
+      </w:r>
+      <w:r>
+        <w:rPr>
+          <w:rStyle w:val="OperatorTok"/>
+        </w:rPr>
+        <w:t xml:space="preserve">)</w:t>
+      </w:r>
+      <w:r>
+        <w:br/>
+      </w:r>
+      <w:r>
+        <w:rPr>
+          <w:rStyle w:val="NormalTok"/>
+        </w:rPr>
+        <w:t xml:space="preserve">  </w:t>
+      </w:r>
+      <w:r>
+        <w:rPr>
+          <w:rStyle w:val="OperatorTok"/>
+        </w:rPr>
+        <w:t xml:space="preserve">(</w:t>
+      </w:r>
+      <w:r>
+        <w:rPr>
+          <w:rStyle w:val="KeywordTok"/>
+        </w:rPr>
+        <w:t xml:space="preserve">map</w:t>
+      </w:r>
+      <w:r>
+        <w:rPr>
+          <w:rStyle w:val="NormalTok"/>
+        </w:rPr>
+        <w:t xml:space="preserve"> </w:t>
+      </w:r>
+      <w:r>
+        <w:rPr>
+          <w:rStyle w:val="OperatorTok"/>
+        </w:rPr>
+        <w:t xml:space="preserve">(</w:t>
+      </w:r>
+      <w:r>
+        <w:rPr>
+          <w:rStyle w:val="KeywordTok"/>
+        </w:rPr>
+        <w:t xml:space="preserve">lambda</w:t>
+      </w:r>
+      <w:r>
+        <w:rPr>
+          <w:rStyle w:val="NormalTok"/>
+        </w:rPr>
+        <w:t xml:space="preserve"> </w:t>
+      </w:r>
+      <w:r>
+        <w:rPr>
+          <w:rStyle w:val="OperatorTok"/>
+        </w:rPr>
+        <w:t xml:space="preserve">(</w:t>
+      </w:r>
+      <w:r>
+        <w:rPr>
+          <w:rStyle w:val="NormalTok"/>
+        </w:rPr>
+        <w:t xml:space="preserve">x</w:t>
+      </w:r>
+      <w:r>
+        <w:rPr>
+          <w:rStyle w:val="OperatorTok"/>
+        </w:rPr>
+        <w:t xml:space="preserve">)</w:t>
+      </w:r>
+      <w:r>
+        <w:rPr>
+          <w:rStyle w:val="NormalTok"/>
+        </w:rPr>
+        <w:t xml:space="preserve"> </w:t>
+      </w:r>
+      <w:r>
+        <w:rPr>
+          <w:rStyle w:val="OperatorTok"/>
+        </w:rPr>
+        <w:t xml:space="preserve">(</w:t>
+      </w:r>
+      <w:r>
+        <w:rPr>
+          <w:rStyle w:val="KeywordTok"/>
+        </w:rPr>
+        <w:t xml:space="preserve">list</w:t>
+      </w:r>
+      <w:r>
+        <w:rPr>
+          <w:rStyle w:val="NormalTok"/>
+        </w:rPr>
+        <w:t xml:space="preserve"> x y</w:t>
+      </w:r>
+      <w:r>
+        <w:rPr>
+          <w:rStyle w:val="OperatorTok"/>
+        </w:rPr>
+        <w:t xml:space="preserve">))</w:t>
+      </w:r>
+      <w:r>
+        <w:rPr>
+          <w:rStyle w:val="NormalTok"/>
+        </w:rPr>
+        <w:t xml:space="preserve"> L</w:t>
+      </w:r>
+      <w:r>
+        <w:rPr>
+          <w:rStyle w:val="OperatorTok"/>
+        </w:rPr>
+        <w:t xml:space="preserve">))</w:t>
+      </w:r>
+    </w:p>
+    <w:p>
+      <w:pPr>
+        <w:pStyle w:val="FirstParagraph"/>
+      </w:pPr>
+      <w:r>
+        <w:t xml:space="preserve">Guess what each expression returns:</w:t>
+      </w:r>
+    </w:p>
+    <w:p>
+      <w:pPr>
+        <w:pStyle w:val="Compact"/>
+        <w:numPr>
+          <w:ilvl w:val="0"/>
+          <w:numId w:val="1015"/>
+        </w:numPr>
+      </w:pPr>
+      <w:r>
+        <w:rPr>
+          <w:rStyle w:val="VerbatimChar"/>
+        </w:rPr>
+        <w:t xml:space="preserve">((lambda (x) (* x x)) 7)</w:t>
+      </w:r>
+    </w:p>
+    <w:p>
+      <w:pPr>
+        <w:pStyle w:val="Compact"/>
+        <w:numPr>
+          <w:ilvl w:val="0"/>
+          <w:numId w:val="1015"/>
+        </w:numPr>
+      </w:pPr>
+      <w:r>
+        <w:rPr>
+          <w:rStyle w:val="VerbatimChar"/>
+        </w:rPr>
+        <w:t xml:space="preserve">(map (lambda (x) (* 2 x)) (list 1 2 3))</w:t>
+      </w:r>
+    </w:p>
+    <w:p>
+      <w:pPr>
+        <w:pStyle w:val="Compact"/>
+        <w:numPr>
+          <w:ilvl w:val="0"/>
+          <w:numId w:val="1015"/>
+        </w:numPr>
+      </w:pPr>
+      <w:r>
+        <w:rPr>
+          <w:rStyle w:val="VerbatimChar"/>
+        </w:rPr>
+        <w:t xml:space="preserve">(pair-with (list 1 2 3) "a")</w:t>
+      </w:r>
+    </w:p>
+    <w:bookmarkEnd w:id="49"/>
+    <w:bookmarkStart w:id="50" w:name="sol-pair-with"/>
+    <w:p>
+      <w:pPr>
+        <w:pStyle w:val="FirstParagraph"/>
+      </w:pPr>
       <w:r>
         <w:rPr>
           <w:i/>
           <w:iCs/>
         </w:rPr>
-        <w:t xml:space="preserve">Expression (Mathematics) —</w:t>
-      </w:r>
+        <w:t xml:space="preserve">Solution 6</w:t>
+      </w:r>
+      <w:r>
+        <w:t xml:space="preserve">. </w:t>
+      </w:r>
+      <w:r>
+        <w:rPr>
+          <w:rStyle w:val="VerbatimChar"/>
+        </w:rPr>
+        <w:t xml:space="preserve">(lambda (x) (* x x))</w:t>
+      </w:r>
+      <w:r>
+        <w:t xml:space="preserve"> </w:t>
+      </w:r>
+      <w:r>
+        <w:t xml:space="preserve">is the function that squares its argument,</w:t>
+      </w:r>
+      <w:r>
+        <w:t xml:space="preserve"> </w:t>
+      </w:r>
+      <w:r>
+        <w:t xml:space="preserve">written in place without a name.</w:t>
+      </w:r>
+    </w:p>
+    <w:p>
+      <w:pPr>
+        <w:pStyle w:val="Compact"/>
+        <w:numPr>
+          <w:ilvl w:val="0"/>
+          <w:numId w:val="1016"/>
+        </w:numPr>
+      </w:pPr>
+      <w:r>
+        <w:t xml:space="preserve">Applying it to 7 returns 49.</w:t>
+      </w:r>
+    </w:p>
+    <w:p>
+      <w:pPr>
+        <w:pStyle w:val="Compact"/>
+        <w:numPr>
+          <w:ilvl w:val="0"/>
+          <w:numId w:val="1016"/>
+        </w:numPr>
+      </w:pPr>
+      <w:r>
+        <w:rPr>
+          <w:rStyle w:val="VerbatimChar"/>
+        </w:rPr>
+        <w:t xml:space="preserve">map</w:t>
+      </w:r>
+      <w:r>
+        <w:t xml:space="preserve"> </w:t>
+      </w:r>
+      <w:r>
+        <w:t xml:space="preserve">(</w:t>
+      </w:r>
+      <w:hyperlink w:anchor="exm-map-filter">
+        <w:r>
+          <w:rPr>
+            <w:rStyle w:val="Hyperlink"/>
+          </w:rPr>
+          <w:t xml:space="preserve">Example 3</w:t>
+        </w:r>
+      </w:hyperlink>
+      <w:r>
+        <w:t xml:space="preserve">) applies the doubling function to each element, and returns</w:t>
+      </w:r>
+      <w:r>
+        <w:t xml:space="preserve"> </w:t>
+      </w:r>
+      <w:r>
+        <w:rPr>
+          <w:rStyle w:val="VerbatimChar"/>
+        </w:rPr>
+        <w:t xml:space="preserve">'(2 4 6)</w:t>
+      </w:r>
+      <w:r>
+        <w:t xml:space="preserve">.</w:t>
+      </w:r>
+    </w:p>
+    <w:p>
+      <w:pPr>
+        <w:pStyle w:val="Compact"/>
+        <w:numPr>
+          <w:ilvl w:val="0"/>
+          <w:numId w:val="1016"/>
+        </w:numPr>
+      </w:pPr>
+      <w:r>
+        <w:t xml:space="preserve">In the body of</w:t>
+      </w:r>
+      <w:r>
+        <w:t xml:space="preserve"> </w:t>
+      </w:r>
+      <w:r>
+        <w:rPr>
+          <w:rStyle w:val="VerbatimChar"/>
+        </w:rPr>
+        <w:t xml:space="preserve">pair-with</w:t>
+      </w:r>
+      <w:r>
+        <w:t xml:space="preserve">,</w:t>
+      </w:r>
+      <w:r>
+        <w:t xml:space="preserve"> </w:t>
+      </w:r>
+      <w:r>
+        <w:rPr>
+          <w:rStyle w:val="VerbatimChar"/>
+        </w:rPr>
+        <w:t xml:space="preserve">y</w:t>
+      </w:r>
+      <w:r>
+        <w:t xml:space="preserve"> </w:t>
+      </w:r>
+      <w:r>
+        <w:t xml:space="preserve">is</w:t>
+      </w:r>
+      <w:r>
+        <w:t xml:space="preserve"> </w:t>
+      </w:r>
+      <w:r>
+        <w:rPr>
+          <w:rStyle w:val="VerbatimChar"/>
+        </w:rPr>
+        <w:t xml:space="preserve">"a"</w:t>
+      </w:r>
+      <w:r>
+        <w:t xml:space="preserve">,</w:t>
+      </w:r>
+      <w:r>
+        <w:t xml:space="preserve"> </w:t>
+      </w:r>
+      <w:r>
+        <w:t xml:space="preserve">so</w:t>
+      </w:r>
+      <w:r>
+        <w:t xml:space="preserve"> </w:t>
+      </w:r>
+      <w:r>
+        <w:rPr>
+          <w:rStyle w:val="VerbatimChar"/>
+        </w:rPr>
+        <w:t xml:space="preserve">map</w:t>
+      </w:r>
+      <w:r>
+        <w:t xml:space="preserve"> </w:t>
+      </w:r>
+      <w:r>
+        <w:t xml:space="preserve">applies the function</w:t>
+      </w:r>
+      <w:r>
+        <w:t xml:space="preserve"> </w:t>
+      </w:r>
+      <m:oMath>
+        <m:r>
+          <m:t>x</m:t>
+        </m:r>
+        <m:r>
+          <m:rPr>
+            <m:sty m:val="p"/>
+          </m:rPr>
+          <m:t>↦</m:t>
+        </m:r>
+        <m:r>
+          <m:rPr>
+            <m:sty m:val="p"/>
+          </m:rPr>
+          <m:t>(</m:t>
+        </m:r>
+        <m:r>
+          <m:t>x</m:t>
+        </m:r>
+        <m:r>
+          <m:rPr>
+            <m:sty m:val="p"/>
+          </m:rPr>
+          <m:t>,</m:t>
+        </m:r>
+        <m:r>
+          <m:rPr>
+            <m:nor/>
+            <m:sty m:val="p"/>
+          </m:rPr>
+          <m:t>"a"</m:t>
+        </m:r>
+        <m:r>
+          <m:rPr>
+            <m:sty m:val="p"/>
+          </m:rPr>
+          <m:t>)</m:t>
+        </m:r>
+      </m:oMath>
+      <w:r>
+        <w:t xml:space="preserve"> </w:t>
+      </w:r>
+      <w:r>
+        <w:t xml:space="preserve">to each element,</w:t>
+      </w:r>
+      <w:r>
+        <w:t xml:space="preserve"> </w:t>
+      </w:r>
+      <w:r>
+        <w:t xml:space="preserve">and returns</w:t>
+      </w:r>
+      <w:r>
+        <w:t xml:space="preserve"> </w:t>
+      </w:r>
+      <w:r>
+        <w:rPr>
+          <w:rStyle w:val="VerbatimChar"/>
+        </w:rPr>
+        <w:t xml:space="preserve">'((1 "a") (2 "a") (3 "a"))</w:t>
+      </w:r>
+      <w:r>
+        <w:t xml:space="preserve">.</w:t>
+      </w:r>
+    </w:p>
+    <w:bookmarkEnd w:id="50"/>
+    <w:bookmarkStart w:id="52" w:name="def-lambda"/>
+    <w:p>
+      <w:pPr>
+        <w:pStyle w:val="FirstParagraph"/>
+      </w:pPr>
+      <w:r>
+        <w:rPr>
+          <w:b/>
+          <w:bCs/>
+        </w:rPr>
+        <w:t xml:space="preserve">Definition 13 (</w:t>
+      </w:r>
+      <w:r>
+        <w:rPr>
+          <w:rStyle w:val="VerbatimChar"/>
+          <w:b/>
+          <w:bCs/>
+        </w:rPr>
+        <w:t xml:space="preserve">lambda</w:t>
+      </w:r>
+      <w:r>
+        <w:rPr>
+          <w:b/>
+          <w:bCs/>
+        </w:rPr>
+        <w:t xml:space="preserve">)</w:t>
+      </w:r>
+      <w:r>
+        <w:t xml:space="preserve"> </w:t>
+      </w:r>
+      <w:r>
+        <w:t xml:space="preserve">The Racket expression</w:t>
+      </w:r>
+    </w:p>
+    <w:p>
+      <w:pPr>
+        <w:pStyle w:val="SourceCode"/>
+      </w:pPr>
+      <w:r>
+        <w:rPr>
+          <w:rStyle w:val="OperatorTok"/>
+        </w:rPr>
+        <w:t xml:space="preserve">(</w:t>
+      </w:r>
+      <w:r>
+        <w:rPr>
+          <w:rStyle w:val="KeywordTok"/>
+        </w:rPr>
+        <w:t xml:space="preserve">lambda</w:t>
+      </w:r>
+      <w:r>
+        <w:rPr>
+          <w:rStyle w:val="NormalTok"/>
+        </w:rPr>
+        <w:t xml:space="preserve"> </w:t>
+      </w:r>
+      <w:r>
+        <w:rPr>
+          <w:rStyle w:val="OperatorTok"/>
+        </w:rPr>
+        <w:t xml:space="preserve">(</w:t>
+      </w:r>
+      <w:r>
+        <w:rPr>
+          <w:rStyle w:val="NormalTok"/>
+        </w:rPr>
+        <w:t xml:space="preserve">x1 ... xn</w:t>
+      </w:r>
+      <w:r>
+        <w:rPr>
+          <w:rStyle w:val="OperatorTok"/>
+        </w:rPr>
+        <w:t xml:space="preserve">)</w:t>
+      </w:r>
+      <w:r>
+        <w:br/>
+      </w:r>
+      <w:r>
+        <w:rPr>
+          <w:rStyle w:val="NormalTok"/>
+        </w:rPr>
+        <w:t xml:space="preserve">  body</w:t>
+      </w:r>
+      <w:r>
+        <w:rPr>
+          <w:rStyle w:val="OperatorTok"/>
+        </w:rPr>
+        <w:t xml:space="preserve">)</w:t>
+      </w:r>
+    </w:p>
+    <w:p>
+      <w:pPr>
+        <w:pStyle w:val="FirstParagraph"/>
+      </w:pPr>
+      <w:r>
+        <w:t xml:space="preserve">is a</w:t>
+      </w:r>
+      <w:r>
+        <w:t xml:space="preserve"> </w:t>
+      </w:r>
+      <w:r>
+        <w:rPr>
+          <w:rStyle w:val="VerbatimChar"/>
+          <w:b/>
+          <w:bCs/>
+        </w:rPr>
+        <w:t xml:space="preserve">lambda</w:t>
+      </w:r>
+      <w:r>
+        <w:rPr>
+          <w:b/>
+          <w:bCs/>
+        </w:rPr>
+        <w:t xml:space="preserve"> </w:t>
+      </w:r>
+      <w:r>
+        <w:rPr>
+          <w:b/>
+          <w:bCs/>
+        </w:rPr>
+        <w:t xml:space="preserve">expression</w:t>
+      </w:r>
+      <w:r>
+        <w:t xml:space="preserve">.</w:t>
+      </w:r>
+      <w:r>
+        <w:t xml:space="preserve"> </w:t>
+      </w:r>
+      <w:r>
+        <w:t xml:space="preserve">Its value is the function with parameters</w:t>
+      </w:r>
+      <w:r>
+        <w:t xml:space="preserve"> </w:t>
+      </w:r>
+      <w:r>
+        <w:rPr>
+          <w:rStyle w:val="VerbatimChar"/>
+        </w:rPr>
+        <w:t xml:space="preserve">x1</w:t>
+      </w:r>
+      <w:r>
+        <w:t xml:space="preserve">, …,</w:t>
+      </w:r>
+      <w:r>
+        <w:t xml:space="preserve"> </w:t>
+      </w:r>
+      <w:r>
+        <w:rPr>
+          <w:rStyle w:val="VerbatimChar"/>
+        </w:rPr>
+        <w:t xml:space="preserve">xn</w:t>
+      </w:r>
+      <w:r>
+        <w:t xml:space="preserve"> </w:t>
+      </w:r>
+      <w:r>
+        <w:t xml:space="preserve">whose value at its arguments is the value of</w:t>
+      </w:r>
+      <w:r>
+        <w:t xml:space="preserve"> </w:t>
+      </w:r>
+      <w:r>
+        <w:rPr>
+          <w:rStyle w:val="VerbatimChar"/>
+        </w:rPr>
+        <w:t xml:space="preserve">body</w:t>
+      </w:r>
+      <w:r>
+        <w:t xml:space="preserve">,</w:t>
+      </w:r>
+      <w:r>
+        <w:t xml:space="preserve"> </w:t>
+      </w:r>
+      <w:r>
+        <w:t xml:space="preserve">found as in</w:t>
+      </w:r>
+      <w:r>
+        <w:t xml:space="preserve"> </w:t>
+      </w:r>
+      <w:hyperlink w:anchor="def-racket-define">
+        <w:r>
+          <w:rPr>
+            <w:rStyle w:val="Hyperlink"/>
+          </w:rPr>
+          <w:t xml:space="preserve">Definition 6</w:t>
+        </w:r>
+      </w:hyperlink>
+      <w:r>
+        <w:t xml:space="preserve">.</w:t>
+      </w:r>
+      <w:r>
+        <w:t xml:space="preserve"> </w:t>
+      </w:r>
+      <w:r>
+        <w:t xml:space="preserve">The function has no name.</w:t>
+      </w:r>
+      <w:r>
+        <w:t xml:space="preserve"> </w:t>
+      </w:r>
+      <w:r>
+        <w:t xml:space="preserve">The body may use any name defined where the</w:t>
+      </w:r>
+      <w:r>
+        <w:t xml:space="preserve"> </w:t>
+      </w:r>
+      <w:r>
+        <w:rPr>
+          <w:rStyle w:val="VerbatimChar"/>
+        </w:rPr>
+        <w:t xml:space="preserve">lambda</w:t>
+      </w:r>
+      <w:r>
+        <w:t xml:space="preserve"> </w:t>
+      </w:r>
+      <w:r>
+        <w:t xml:space="preserve">expression appears,</w:t>
+      </w:r>
+      <w:r>
+        <w:t xml:space="preserve"> </w:t>
+      </w:r>
+      <w:r>
+        <w:t xml:space="preserve">as the body of the</w:t>
+      </w:r>
+      <w:r>
+        <w:t xml:space="preserve"> </w:t>
+      </w:r>
+      <w:r>
+        <w:rPr>
+          <w:rStyle w:val="VerbatimChar"/>
+        </w:rPr>
+        <w:t xml:space="preserve">lambda</w:t>
+      </w:r>
+      <w:r>
+        <w:t xml:space="preserve"> </w:t>
+      </w:r>
+      <w:r>
+        <w:t xml:space="preserve">in</w:t>
+      </w:r>
+      <w:r>
+        <w:t xml:space="preserve"> </w:t>
+      </w:r>
+      <w:r>
+        <w:rPr>
+          <w:rStyle w:val="VerbatimChar"/>
+        </w:rPr>
+        <w:t xml:space="preserve">pair-with</w:t>
+      </w:r>
+      <w:r>
+        <w:t xml:space="preserve"> </w:t>
+      </w:r>
+      <w:r>
+        <w:t xml:space="preserve">(</w:t>
+      </w:r>
+      <w:hyperlink w:anchor="exr-pair-with">
+        <w:r>
+          <w:rPr>
+            <w:rStyle w:val="Hyperlink"/>
+          </w:rPr>
+          <w:t xml:space="preserve">Exercise 6</w:t>
+        </w:r>
+      </w:hyperlink>
+      <w:r>
+        <w:t xml:space="preserve">) uses</w:t>
+      </w:r>
+      <w:r>
+        <w:t xml:space="preserve"> </w:t>
+      </w:r>
+      <w:r>
+        <w:rPr>
+          <w:rStyle w:val="VerbatimChar"/>
+        </w:rPr>
+        <w:t xml:space="preserve">y</w:t>
+      </w:r>
+      <w:r>
+        <w:t xml:space="preserve">.</w:t>
+      </w:r>
+    </w:p>
+    <w:p>
+      <w:pPr>
+        <w:pStyle w:val="BodyText"/>
+      </w:pPr>
+      <w:r>
+        <w:t xml:space="preserve">The definition</w:t>
+      </w:r>
+      <w:r>
+        <w:t xml:space="preserve"> </w:t>
+      </w:r>
+      <w:r>
+        <w:rPr>
+          <w:rStyle w:val="VerbatimChar"/>
+        </w:rPr>
+        <w:t xml:space="preserve">(define (f x) body)</w:t>
+      </w:r>
+      <w:r>
+        <w:t xml:space="preserve"> </w:t>
+      </w:r>
+      <w:r>
+        <w:t xml:space="preserve">is shorthand for</w:t>
+      </w:r>
+      <w:r>
+        <w:t xml:space="preserve"> </w:t>
+      </w:r>
+      <w:r>
+        <w:rPr>
+          <w:rStyle w:val="VerbatimChar"/>
+        </w:rPr>
+        <w:t xml:space="preserve">(define f (lambda (x) body))</w:t>
+      </w:r>
+      <w:r>
+        <w:t xml:space="preserve">:</w:t>
+      </w:r>
+      <w:r>
+        <w:t xml:space="preserve"> </w:t>
+      </w:r>
+      <w:r>
+        <w:t xml:space="preserve">it gives the name</w:t>
+      </w:r>
+      <w:r>
+        <w:t xml:space="preserve"> </w:t>
+      </w:r>
+      <w:r>
+        <w:rPr>
+          <w:rStyle w:val="VerbatimChar"/>
+        </w:rPr>
+        <w:t xml:space="preserve">f</w:t>
+      </w:r>
+      <w:r>
+        <w:t xml:space="preserve"> </w:t>
+      </w:r>
+      <w:r>
+        <w:t xml:space="preserve">to the function the</w:t>
+      </w:r>
+      <w:r>
+        <w:t xml:space="preserve"> </w:t>
+      </w:r>
+      <w:r>
+        <w:rPr>
+          <w:rStyle w:val="VerbatimChar"/>
+        </w:rPr>
+        <w:t xml:space="preserve">lambda</w:t>
+      </w:r>
+      <w:r>
+        <w:t xml:space="preserve"> </w:t>
+      </w:r>
+      <w:r>
+        <w:t xml:space="preserve">expression makes.</w:t>
+      </w:r>
+    </w:p>
+    <w:p>
+      <w:pPr>
+        <w:pStyle w:val="BodyText"/>
+      </w:pPr>
       <w:r>
         <w:rPr>
           <w:i/>
           <w:iCs/>
         </w:rPr>
-        <w:t xml:space="preserve"> </w:t>
-      </w:r>
+        <w:t xml:space="preserve">Video:</w:t>
+      </w:r>
+      <w:r>
+        <w:t xml:space="preserve"> </w:t>
+      </w:r>
+      <w:r>
+        <w:t xml:space="preserve">Jerry Cain uses</w:t>
+      </w:r>
+      <w:r>
+        <w:t xml:space="preserve"> </w:t>
+      </w:r>
+      <w:r>
+        <w:rPr>
+          <w:rStyle w:val="VerbatimChar"/>
+        </w:rPr>
+        <w:t xml:space="preserve">lambda</w:t>
+      </w:r>
+      <w:r>
+        <w:t xml:space="preserve"> </w:t>
+      </w:r>
+      <w:r>
+        <w:t xml:space="preserve">with</w:t>
+      </w:r>
+      <w:r>
+        <w:t xml:space="preserve"> </w:t>
+      </w:r>
+      <w:r>
+        <w:rPr>
+          <w:rStyle w:val="VerbatimChar"/>
+        </w:rPr>
+        <w:t xml:space="preserve">map</w:t>
+      </w:r>
+      <w:r>
+        <w:t xml:space="preserve"> </w:t>
+      </w:r>
+      <w:r>
+        <w:t xml:space="preserve">in Scheme, the language Racket grew out of, in</w:t>
+      </w:r>
+      <w:r>
+        <w:t xml:space="preserve"> </w:t>
+      </w:r>
+      <w:hyperlink r:id="rId51">
+        <w:r>
+          <w:rPr>
+            <w:rStyle w:val="Hyperlink"/>
+          </w:rPr>
+          <w:t xml:space="preserve">Stanford CS 107 Lecture 22</w:t>
+        </w:r>
+      </w:hyperlink>
+      <w:r>
+        <w:t xml:space="preserve"> </w:t>
+      </w:r>
+      <w:r>
+        <w:t xml:space="preserve">(Cain 2008)</w:t>
+      </w:r>
+      <w:r>
+        <w:t xml:space="preserve">.</w:t>
+      </w:r>
+    </w:p>
+    <w:bookmarkEnd w:id="52"/>
+    <w:bookmarkStart w:id="54" w:name="rem-lambda-calculus"/>
+    <w:p>
+      <w:pPr>
+        <w:pStyle w:val="BodyText"/>
+      </w:pPr>
       <w:r>
         <w:rPr>
           <w:i/>
           <w:iCs/>
         </w:rPr>
-        <w:t xml:space="preserve">Wikipedia</w:t>
-      </w:r>
+        <w:t xml:space="preserve">Remark 4</w:t>
+      </w:r>
+      <w:r>
+        <w:t xml:space="preserve"> (Where the name comes from). </w:t>
+      </w:r>
+      <w:r>
+        <w:t xml:space="preserve">The word</w:t>
+      </w:r>
+      <w:r>
+        <w:t xml:space="preserve"> </w:t>
+      </w:r>
+      <w:r>
+        <w:rPr>
+          <w:rStyle w:val="VerbatimChar"/>
+        </w:rPr>
+        <w:t xml:space="preserve">lambda</w:t>
+      </w:r>
+      <w:r>
+        <w:t xml:space="preserve"> </w:t>
+      </w:r>
+      <w:r>
+        <w:t xml:space="preserve">comes from the lambda calculus,</w:t>
+      </w:r>
+      <w:r>
+        <w:t xml:space="preserve"> </w:t>
+      </w:r>
+      <w:r>
+        <w:t xml:space="preserve">a model of computation in which a function is written</w:t>
+      </w:r>
+      <w:r>
+        <w:t xml:space="preserve"> </w:t>
+      </w:r>
+      <m:oMath>
+        <m:r>
+          <m:t>λ</m:t>
+        </m:r>
+        <m:r>
+          <m:t>x</m:t>
+        </m:r>
+        <m:r>
+          <m:rPr>
+            <m:sty m:val="p"/>
+          </m:rPr>
+          <m:t>.</m:t>
+        </m:r>
+        <m:r>
+          <m:t> </m:t>
+        </m:r>
+        <m:r>
+          <m:t>e</m:t>
+        </m:r>
+      </m:oMath>
+      <w:r>
+        <w:t xml:space="preserve">,</w:t>
+      </w:r>
+      <w:r>
+        <w:t xml:space="preserve"> </w:t>
+      </w:r>
+      <w:r>
+        <w:t xml:space="preserve">the function that takes</w:t>
+      </w:r>
+      <w:r>
+        <w:t xml:space="preserve"> </w:t>
+      </w:r>
+      <m:oMath>
+        <m:r>
+          <m:t>x</m:t>
+        </m:r>
+      </m:oMath>
+      <w:r>
+        <w:t xml:space="preserve"> </w:t>
+      </w:r>
+      <w:r>
+        <w:t xml:space="preserve">to the value of the expression</w:t>
+      </w:r>
+      <w:r>
+        <w:t xml:space="preserve"> </w:t>
+      </w:r>
+      <m:oMath>
+        <m:r>
+          <m:t>e</m:t>
+        </m:r>
+      </m:oMath>
+      <w:r>
+        <w:t xml:space="preserve">.</w:t>
+      </w:r>
+      <w:r>
+        <w:t xml:space="preserve"> </w:t>
+      </w:r>
+      <w:r>
+        <w:t xml:space="preserve">The lambda calculus has only three features:</w:t>
+      </w:r>
+      <w:r>
+        <w:t xml:space="preserve"> </w:t>
+      </w:r>
+      <w:r>
+        <w:t xml:space="preserve">functions, applying a function to an argument, and variables.</w:t>
+      </w:r>
+      <w:r>
+        <w:t xml:space="preserve"> </w:t>
+      </w:r>
+      <w:r>
+        <w:t xml:space="preserve">It has no numbers, strings or loops</w:t>
+      </w:r>
+      <w:r>
+        <w:t xml:space="preserve"> </w:t>
+      </w:r>
+      <w:r>
+        <w:t xml:space="preserve">(Crichton 2019)</w:t>
+      </w:r>
+      <w:r>
+        <w:t xml:space="preserve">.</w:t>
+      </w:r>
+      <w:r>
+        <w:t xml:space="preserve"> </w:t>
+      </w:r>
+      <w:r>
+        <w:t xml:space="preserve">Applying</w:t>
+      </w:r>
+      <w:r>
+        <w:t xml:space="preserve"> </w:t>
+      </w:r>
+      <m:oMath>
+        <m:r>
+          <m:t>λ</m:t>
+        </m:r>
+        <m:r>
+          <m:t>x</m:t>
+        </m:r>
+        <m:r>
+          <m:rPr>
+            <m:sty m:val="p"/>
+          </m:rPr>
+          <m:t>.</m:t>
+        </m:r>
+        <m:r>
+          <m:t> </m:t>
+        </m:r>
+        <m:r>
+          <m:t>e</m:t>
+        </m:r>
+      </m:oMath>
+      <w:r>
+        <w:t xml:space="preserve"> </w:t>
+      </w:r>
+      <w:r>
+        <w:t xml:space="preserve">to an argument replaces each</w:t>
+      </w:r>
+      <w:r>
+        <w:t xml:space="preserve"> </w:t>
+      </w:r>
+      <m:oMath>
+        <m:r>
+          <m:t>x</m:t>
+        </m:r>
+      </m:oMath>
+      <w:r>
+        <w:t xml:space="preserve"> </w:t>
+      </w:r>
+      <w:r>
+        <w:t xml:space="preserve">in</w:t>
+      </w:r>
+      <w:r>
+        <w:t xml:space="preserve"> </w:t>
+      </w:r>
+      <m:oMath>
+        <m:r>
+          <m:t>e</m:t>
+        </m:r>
+      </m:oMath>
+      <w:r>
+        <w:t xml:space="preserve"> </w:t>
+      </w:r>
+      <w:r>
+        <w:t xml:space="preserve">by that argument,</w:t>
+      </w:r>
+      <w:r>
+        <w:t xml:space="preserve"> </w:t>
+      </w:r>
+      <w:r>
+        <w:t xml:space="preserve">as in evaluation by substitution (</w:t>
+      </w:r>
+      <w:hyperlink w:anchor="exm-substitution">
+        <w:r>
+          <w:rPr>
+            <w:rStyle w:val="Hyperlink"/>
+          </w:rPr>
+          <w:t xml:space="preserve">Example 1</w:t>
+        </w:r>
+      </w:hyperlink>
+      <w:r>
+        <w:t xml:space="preserve">).</w:t>
+      </w:r>
+      <w:r>
+        <w:t xml:space="preserve"> </w:t>
+      </w:r>
+      <w:r>
+        <w:t xml:space="preserve">The function in</w:t>
+      </w:r>
+      <w:r>
+        <w:t xml:space="preserve"> </w:t>
+      </w:r>
+      <w:hyperlink w:anchor="exr-pair-with">
+        <w:r>
+          <w:rPr>
+            <w:rStyle w:val="Hyperlink"/>
+          </w:rPr>
+          <w:t xml:space="preserve">Exercise 6</w:t>
+        </w:r>
+      </w:hyperlink>
+      <w:r>
+        <w:t xml:space="preserve"> </w:t>
+      </w:r>
+      <w:r>
+        <w:t xml:space="preserve">that squares its argument is</w:t>
+      </w:r>
+      <w:r>
+        <w:t xml:space="preserve"> </w:t>
+      </w:r>
+      <m:oMath>
+        <m:r>
+          <m:t>λ</m:t>
+        </m:r>
+        <m:r>
+          <m:t>x</m:t>
+        </m:r>
+        <m:r>
+          <m:rPr>
+            <m:sty m:val="p"/>
+          </m:rPr>
+          <m:t>.</m:t>
+        </m:r>
+        <m:r>
+          <m:t> </m:t>
+        </m:r>
+        <m:r>
+          <m:t>x</m:t>
+        </m:r>
+        <m:r>
+          <m:rPr>
+            <m:sty m:val="p"/>
+          </m:rPr>
+          <m:t>⋅</m:t>
+        </m:r>
+        <m:r>
+          <m:t>x</m:t>
+        </m:r>
+      </m:oMath>
+      <w:r>
+        <w:t xml:space="preserve">.</w:t>
+      </w:r>
+    </w:p>
+    <w:p>
+      <w:pPr>
+        <w:pStyle w:val="BodyText"/>
+      </w:pPr>
       <w:r>
         <w:rPr>
           <w:i/>
           <w:iCs/>
         </w:rPr>
-        <w:t xml:space="preserve">,</w:t>
+        <w:t xml:space="preserve">Media:</w:t>
+      </w:r>
+      <w:r>
+        <w:t xml:space="preserve"> </w:t>
+      </w:r>
+      <w:r>
+        <w:t xml:space="preserve">Will Crichton’s</w:t>
+      </w:r>
+      <w:r>
+        <w:t xml:space="preserve"> </w:t>
+      </w:r>
+      <w:hyperlink r:id="rId53">
+        <w:r>
+          <w:rPr>
+            <w:rStyle w:val="Hyperlink"/>
+          </w:rPr>
+          <w:t xml:space="preserve">notes on the lambda calculus</w:t>
+        </w:r>
+      </w:hyperlink>
+      <w:r>
+        <w:t xml:space="preserve">, from Stanford’s CS 242,</w:t>
+      </w:r>
+      <w:r>
+        <w:t xml:space="preserve"> </w:t>
       </w:r>
       <w:r>
         <w:rPr>
           <w:i/>
           <w:iCs/>
         </w:rPr>
+        <w:t xml:space="preserve">Programming Languages</w:t>
+      </w:r>
+      <w:r>
+        <w:t xml:space="preserve">, go further</w:t>
+      </w:r>
+      <w:r>
+        <w:t xml:space="preserve"> </w:t>
+      </w:r>
+      <w:r>
+        <w:t xml:space="preserve">(Crichton 2019)</w:t>
+      </w:r>
+      <w:r>
+        <w:t xml:space="preserve">.</w:t>
+      </w:r>
+    </w:p>
+    <w:bookmarkEnd w:id="54"/>
+    <w:bookmarkStart w:id="55" w:name="exm-adder"/>
+    <w:p>
+      <w:pPr>
+        <w:pStyle w:val="BodyText"/>
+      </w:pPr>
+      <w:r>
+        <w:rPr>
+          <w:b/>
+          <w:bCs/>
+        </w:rPr>
+        <w:t xml:space="preserve">Example 4 (A function that returns a function)</w:t>
+      </w:r>
+      <w:r>
+        <w:t xml:space="preserve"> </w:t>
+      </w:r>
+      <w:r>
+        <w:t xml:space="preserve">The function</w:t>
+      </w:r>
+      <w:r>
+        <w:t xml:space="preserve"> </w:t>
+      </w:r>
+      <w:r>
+        <w:rPr>
+          <w:rStyle w:val="VerbatimChar"/>
+        </w:rPr>
+        <w:t xml:space="preserve">adder</w:t>
+      </w:r>
+      <w:r>
+        <w:t xml:space="preserve"> </w:t>
+      </w:r>
+      <w:r>
+        <w:t xml:space="preserve">takes a number</w:t>
+      </w:r>
+      <w:r>
+        <w:t xml:space="preserve"> </w:t>
+      </w:r>
+      <w:r>
+        <w:rPr>
+          <w:rStyle w:val="VerbatimChar"/>
+        </w:rPr>
+        <w:t xml:space="preserve">d</w:t>
+      </w:r>
+      <w:r>
+        <w:t xml:space="preserve"> </w:t>
+      </w:r>
+      <w:r>
+        <w:t xml:space="preserve">and returns a function:</w:t>
+      </w:r>
+    </w:p>
+    <w:p>
+      <w:pPr>
+        <w:pStyle w:val="SourceCode"/>
+      </w:pPr>
+      <w:r>
+        <w:rPr>
+          <w:rStyle w:val="OperatorTok"/>
+        </w:rPr>
+        <w:t xml:space="preserve">(</w:t>
+      </w:r>
+      <w:r>
+        <w:rPr>
+          <w:rStyle w:val="ExtensionTok"/>
+        </w:rPr>
+        <w:t xml:space="preserve">define</w:t>
+      </w:r>
+      <w:r>
+        <w:rPr>
+          <w:rStyle w:val="FunctionTok"/>
+        </w:rPr>
+        <w:t xml:space="preserve"> </w:t>
+      </w:r>
+      <w:r>
+        <w:rPr>
+          <w:rStyle w:val="OperatorTok"/>
+        </w:rPr>
+        <w:t xml:space="preserve">(</w:t>
+      </w:r>
+      <w:r>
+        <w:rPr>
+          <w:rStyle w:val="NormalTok"/>
+        </w:rPr>
+        <w:t xml:space="preserve">adder d</w:t>
+      </w:r>
+      <w:r>
+        <w:rPr>
+          <w:rStyle w:val="OperatorTok"/>
+        </w:rPr>
+        <w:t xml:space="preserve">)</w:t>
+      </w:r>
+      <w:r>
+        <w:br/>
+      </w:r>
+      <w:r>
+        <w:rPr>
+          <w:rStyle w:val="NormalTok"/>
+        </w:rPr>
+        <w:t xml:space="preserve">  </w:t>
+      </w:r>
+      <w:r>
+        <w:rPr>
+          <w:rStyle w:val="OperatorTok"/>
+        </w:rPr>
+        <w:t xml:space="preserve">(</w:t>
+      </w:r>
+      <w:r>
+        <w:rPr>
+          <w:rStyle w:val="KeywordTok"/>
+        </w:rPr>
+        <w:t xml:space="preserve">lambda</w:t>
+      </w:r>
+      <w:r>
+        <w:rPr>
+          <w:rStyle w:val="NormalTok"/>
+        </w:rPr>
+        <w:t xml:space="preserve"> </w:t>
+      </w:r>
+      <w:r>
+        <w:rPr>
+          <w:rStyle w:val="OperatorTok"/>
+        </w:rPr>
+        <w:t xml:space="preserve">(</w:t>
+      </w:r>
+      <w:r>
+        <w:rPr>
+          <w:rStyle w:val="NormalTok"/>
+        </w:rPr>
+        <w:t xml:space="preserve">x</w:t>
+      </w:r>
+      <w:r>
+        <w:rPr>
+          <w:rStyle w:val="OperatorTok"/>
+        </w:rPr>
+        <w:t xml:space="preserve">)</w:t>
+      </w:r>
+      <w:r>
+        <w:rPr>
+          <w:rStyle w:val="NormalTok"/>
+        </w:rPr>
+        <w:t xml:space="preserve"> </w:t>
+      </w:r>
+      <w:r>
+        <w:rPr>
+          <w:rStyle w:val="OperatorTok"/>
+        </w:rPr>
+        <w:t xml:space="preserve">(+</w:t>
+      </w:r>
+      <w:r>
+        <w:rPr>
+          <w:rStyle w:val="NormalTok"/>
+        </w:rPr>
+        <w:t xml:space="preserve"> x d</w:t>
+      </w:r>
+      <w:r>
+        <w:rPr>
+          <w:rStyle w:val="OperatorTok"/>
+        </w:rPr>
+        <w:t xml:space="preserve">)))</w:t>
+      </w:r>
+    </w:p>
+    <w:p>
+      <w:pPr>
+        <w:pStyle w:val="FirstParagraph"/>
+      </w:pPr>
+      <w:r>
+        <w:rPr>
+          <w:rStyle w:val="VerbatimChar"/>
+        </w:rPr>
+        <w:t xml:space="preserve">(adder 3)</w:t>
+      </w:r>
+      <w:r>
+        <w:t xml:space="preserve"> </w:t>
+      </w:r>
+      <w:r>
+        <w:t xml:space="preserve">returns the function</w:t>
+      </w:r>
+      <w:r>
+        <w:t xml:space="preserve"> </w:t>
+      </w:r>
+      <m:oMath>
+        <m:r>
+          <m:t>x</m:t>
+        </m:r>
+        <m:r>
+          <m:rPr>
+            <m:sty m:val="p"/>
+          </m:rPr>
+          <m:t>↦</m:t>
+        </m:r>
+        <m:r>
+          <m:t>x</m:t>
+        </m:r>
+        <m:r>
+          <m:rPr>
+            <m:sty m:val="p"/>
+          </m:rPr>
+          <m:t>+</m:t>
+        </m:r>
+        <m:r>
+          <m:t>3</m:t>
+        </m:r>
+      </m:oMath>
+      <w:r>
+        <w:t xml:space="preserve">,</w:t>
+      </w:r>
+      <w:r>
+        <w:t xml:space="preserve"> </w:t>
+      </w:r>
+      <w:r>
+        <w:t xml:space="preserve">which still knows that</w:t>
+      </w:r>
+      <w:r>
+        <w:t xml:space="preserve"> </w:t>
+      </w:r>
+      <w:r>
+        <w:rPr>
+          <w:rStyle w:val="VerbatimChar"/>
+        </w:rPr>
+        <w:t xml:space="preserve">d</w:t>
+      </w:r>
+      <w:r>
+        <w:t xml:space="preserve"> </w:t>
+      </w:r>
+      <w:r>
+        <w:t xml:space="preserve">is 3 after</w:t>
+      </w:r>
+      <w:r>
+        <w:t xml:space="preserve"> </w:t>
+      </w:r>
+      <w:r>
+        <w:rPr>
+          <w:rStyle w:val="VerbatimChar"/>
+        </w:rPr>
+        <w:t xml:space="preserve">adder</w:t>
+      </w:r>
+      <w:r>
+        <w:t xml:space="preserve"> </w:t>
+      </w:r>
+      <w:r>
+        <w:t xml:space="preserve">has returned.</w:t>
+      </w:r>
+      <w:r>
+        <w:t xml:space="preserve"> </w:t>
+      </w:r>
+      <w:r>
+        <w:t xml:space="preserve">So</w:t>
+      </w:r>
+      <w:r>
+        <w:t xml:space="preserve"> </w:t>
+      </w:r>
+      <w:r>
+        <w:rPr>
+          <w:rStyle w:val="VerbatimChar"/>
+        </w:rPr>
+        <w:t xml:space="preserve">adder</w:t>
+      </w:r>
+      <w:r>
+        <w:t xml:space="preserve"> </w:t>
+      </w:r>
+      <w:r>
+        <w:t xml:space="preserve">is a higher-order function (</w:t>
+      </w:r>
+      <w:hyperlink w:anchor="def-higher-order">
+        <w:r>
+          <w:rPr>
+            <w:rStyle w:val="Hyperlink"/>
+          </w:rPr>
+          <w:t xml:space="preserve">Definition 12</w:t>
+        </w:r>
+      </w:hyperlink>
+      <w:r>
+        <w:t xml:space="preserve">), and its value can be used anywhere a function can:</w:t>
+      </w:r>
+    </w:p>
+    <w:p>
+      <w:pPr>
+        <w:pStyle w:val="Compact"/>
+        <w:numPr>
+          <w:ilvl w:val="0"/>
+          <w:numId w:val="1017"/>
+        </w:numPr>
+      </w:pPr>
+      <w:r>
+        <w:rPr>
+          <w:rStyle w:val="VerbatimChar"/>
+        </w:rPr>
+        <w:t xml:space="preserve">((adder 3) 4)</w:t>
+      </w:r>
+      <w:r>
+        <w:t xml:space="preserve"> </w:t>
+      </w:r>
+      <w:r>
+        <w:t xml:space="preserve">returns 7.</w:t>
+      </w:r>
+    </w:p>
+    <w:p>
+      <w:pPr>
+        <w:pStyle w:val="Compact"/>
+        <w:numPr>
+          <w:ilvl w:val="0"/>
+          <w:numId w:val="1017"/>
+        </w:numPr>
+      </w:pPr>
+      <w:r>
+        <w:rPr>
+          <w:rStyle w:val="VerbatimChar"/>
+        </w:rPr>
+        <w:t xml:space="preserve">(twice (adder 3) 10)</w:t>
+      </w:r>
+      <w:r>
+        <w:t xml:space="preserve">, with</w:t>
+      </w:r>
+      <w:r>
+        <w:t xml:space="preserve"> </w:t>
+      </w:r>
+      <w:r>
+        <w:rPr>
+          <w:rStyle w:val="VerbatimChar"/>
+        </w:rPr>
+        <w:t xml:space="preserve">twice</w:t>
+      </w:r>
+      <w:r>
+        <w:t xml:space="preserve"> </w:t>
+      </w:r>
+      <w:r>
+        <w:t xml:space="preserve">from</w:t>
+      </w:r>
+      <w:r>
+        <w:t xml:space="preserve"> </w:t>
+      </w:r>
+      <w:hyperlink w:anchor="exr-twice">
+        <w:r>
+          <w:rPr>
+            <w:rStyle w:val="Hyperlink"/>
+          </w:rPr>
+          <w:t xml:space="preserve">Exercise 5</w:t>
+        </w:r>
+      </w:hyperlink>
+      <w:r>
+        <w:t xml:space="preserve">, returns 16.</w:t>
+      </w:r>
+    </w:p>
+    <w:p>
+      <w:pPr>
+        <w:pStyle w:val="Compact"/>
+        <w:numPr>
+          <w:ilvl w:val="0"/>
+          <w:numId w:val="1017"/>
+        </w:numPr>
+      </w:pPr>
+      <w:r>
+        <w:rPr>
+          <w:rStyle w:val="VerbatimChar"/>
+        </w:rPr>
+        <w:t xml:space="preserve">(map (adder 1) (list 5 7 9))</w:t>
+      </w:r>
+      <w:r>
+        <w:t xml:space="preserve"> </w:t>
+      </w:r>
+      <w:r>
+        <w:t xml:space="preserve">returns</w:t>
+      </w:r>
+      <w:r>
+        <w:t xml:space="preserve"> </w:t>
+      </w:r>
+      <w:r>
+        <w:rPr>
+          <w:rStyle w:val="VerbatimChar"/>
+        </w:rPr>
+        <w:t xml:space="preserve">'(6 8 10)</w:t>
+      </w:r>
+      <w:r>
+        <w:t xml:space="preserve">.</w:t>
+      </w:r>
+    </w:p>
+    <w:bookmarkEnd w:id="55"/>
+    <w:bookmarkEnd w:id="56"/>
+    <w:bookmarkStart w:id="71" w:name="references"/>
+    <w:p>
+      <w:pPr>
+        <w:pStyle w:val="Heading1"/>
+      </w:pPr>
+      <w:r>
+        <w:t xml:space="preserve">References</w:t>
+      </w:r>
+    </w:p>
+    <w:bookmarkStart w:id="70" w:name="refs"/>
+    <w:bookmarkStart w:id="57" w:name="ref-cain2008cs107videos"/>
+    <w:p>
+      <w:pPr>
+        <w:pStyle w:val="Bibliography"/>
+      </w:pPr>
+      <w:r>
+        <w:t xml:space="preserve">Cain, Jerry. 2008.</w:t>
+      </w:r>
+      <w:r>
         <w:t xml:space="preserve"> </w:t>
       </w:r>
       <w:r>
@@ -6661,6 +8235,157 @@
           <w:i/>
           <w:iCs/>
         </w:rPr>
+        <w:t xml:space="preserve">Programming Paradigms (</w:t>
+      </w:r>
+      <w:r>
+        <w:rPr>
+          <w:i/>
+          <w:iCs/>
+        </w:rPr>
+        <w:t xml:space="preserve">Stanford</w:t>
+      </w:r>
+      <w:r>
+        <w:rPr>
+          <w:i/>
+          <w:iCs/>
+        </w:rPr>
+        <w:t xml:space="preserve"> </w:t>
+      </w:r>
+      <w:r>
+        <w:rPr>
+          <w:i/>
+          <w:iCs/>
+        </w:rPr>
+        <w:t xml:space="preserve">CS107</w:t>
+      </w:r>
+      <w:r>
+        <w:rPr>
+          <w:i/>
+          <w:iCs/>
+        </w:rPr>
+        <w:t xml:space="preserve">), Lecture 22</w:t>
+      </w:r>
+      <w:r>
+        <w:t xml:space="preserve">. YouTube.</w:t>
+      </w:r>
+      <w:r>
+        <w:t xml:space="preserve"> </w:t>
+      </w:r>
+      <w:hyperlink r:id="rId51">
+        <w:r>
+          <w:rPr>
+            <w:rStyle w:val="Hyperlink"/>
+          </w:rPr>
+          <w:t xml:space="preserve">https://www.youtube.com/watch?v=3LeCydausnk</w:t>
+        </w:r>
+      </w:hyperlink>
+      <w:r>
+        <w:t xml:space="preserve">.</w:t>
+      </w:r>
+    </w:p>
+    <w:bookmarkEnd w:id="57"/>
+    <w:bookmarkStart w:id="59" w:name="ref-crichton2019cs242"/>
+    <w:p>
+      <w:pPr>
+        <w:pStyle w:val="Bibliography"/>
+      </w:pPr>
+      <w:r>
+        <w:t xml:space="preserve">Crichton, Will. 2019.</w:t>
+      </w:r>
+      <w:r>
+        <w:t xml:space="preserve"> </w:t>
+      </w:r>
+      <w:r>
+        <w:rPr>
+          <w:i/>
+          <w:iCs/>
+        </w:rPr>
+        <w:t xml:space="preserve">CS</w:t>
+      </w:r>
+      <w:r>
+        <w:rPr>
+          <w:i/>
+          <w:iCs/>
+        </w:rPr>
+        <w:t xml:space="preserve"> </w:t>
+      </w:r>
+      <w:r>
+        <w:rPr>
+          <w:i/>
+          <w:iCs/>
+        </w:rPr>
+        <w:t xml:space="preserve">242: Programming Languages, Fall 2019</w:t>
+      </w:r>
+      <w:r>
+        <w:t xml:space="preserve">. Stanford University.</w:t>
+      </w:r>
+      <w:r>
+        <w:t xml:space="preserve"> </w:t>
+      </w:r>
+      <w:hyperlink r:id="rId58">
+        <w:r>
+          <w:rPr>
+            <w:rStyle w:val="Hyperlink"/>
+          </w:rPr>
+          <w:t xml:space="preserve">https://stanford-cs242.github.io/f19/</w:t>
+        </w:r>
+      </w:hyperlink>
+      <w:r>
+        <w:t xml:space="preserve">.</w:t>
+      </w:r>
+    </w:p>
+    <w:bookmarkEnd w:id="59"/>
+    <w:bookmarkStart w:id="61" w:name="ref-wikipedia_expression_mathematics"/>
+    <w:p>
+      <w:pPr>
+        <w:pStyle w:val="Bibliography"/>
+      </w:pPr>
+      <w:r>
+        <w:t xml:space="preserve">Wikipedia contributors. 2026a.</w:t>
+      </w:r>
+      <w:r>
+        <w:t xml:space="preserve"> </w:t>
+      </w:r>
+      <w:r>
+        <w:rPr>
+          <w:i/>
+          <w:iCs/>
+        </w:rPr>
+        <w:t xml:space="preserve">Expression (Mathematics) —</w:t>
+      </w:r>
+      <w:r>
+        <w:rPr>
+          <w:i/>
+          <w:iCs/>
+        </w:rPr>
+        <w:t xml:space="preserve"> </w:t>
+      </w:r>
+      <w:r>
+        <w:rPr>
+          <w:i/>
+          <w:iCs/>
+        </w:rPr>
+        <w:t xml:space="preserve">Wikipedia</w:t>
+      </w:r>
+      <w:r>
+        <w:rPr>
+          <w:i/>
+          <w:iCs/>
+        </w:rPr>
+        <w:t xml:space="preserve">,</w:t>
+      </w:r>
+      <w:r>
+        <w:rPr>
+          <w:i/>
+          <w:iCs/>
+        </w:rPr>
+        <w:t xml:space="preserve"> </w:t>
+      </w:r>
+      <w:r>
+        <w:rPr>
+          <w:i/>
+          <w:iCs/>
+        </w:rPr>
         <w:t xml:space="preserve">the Free Encyclopedia</w:t>
       </w:r>
       <w:r>
@@ -6669,7 +8394,7 @@
       <w:r>
         <w:t xml:space="preserve"> </w:t>
       </w:r>
-      <w:hyperlink r:id="rId49">
+      <w:hyperlink r:id="rId60">
         <w:r>
           <w:rPr>
             <w:rStyle w:val="Hyperlink"/>
@@ -6681,8 +8406,8 @@
         <w:t xml:space="preserve">.</w:t>
       </w:r>
     </w:p>
-    <w:bookmarkEnd w:id="50"/>
-    <w:bookmarkStart w:id="52" w:name="ref-wikipedia_function_mathematics"/>
+    <w:bookmarkEnd w:id="61"/>
+    <w:bookmarkStart w:id="63" w:name="ref-wikipedia_function_mathematics"/>
     <w:p>
       <w:pPr>
         <w:pStyle w:val="Bibliography"/>
@@ -6741,7 +8466,7 @@
       <w:r>
         <w:t xml:space="preserve"> </w:t>
       </w:r>
-      <w:hyperlink r:id="rId51">
+      <w:hyperlink r:id="rId62">
         <w:r>
           <w:rPr>
             <w:rStyle w:val="Hyperlink"/>
@@ -6753,8 +8478,8 @@
         <w:t xml:space="preserve">.</w:t>
       </w:r>
     </w:p>
-    <w:bookmarkEnd w:id="52"/>
-    <w:bookmarkStart w:id="54" w:name="ref-wikipedia_functional_programming"/>
+    <w:bookmarkEnd w:id="63"/>
+    <w:bookmarkStart w:id="65" w:name="ref-wikipedia_functional_programming"/>
     <w:p>
       <w:pPr>
         <w:pStyle w:val="Bibliography"/>
@@ -6813,7 +8538,7 @@
       <w:r>
         <w:t xml:space="preserve"> </w:t>
       </w:r>
-      <w:hyperlink r:id="rId53">
+      <w:hyperlink r:id="rId64">
         <w:r>
           <w:rPr>
             <w:rStyle w:val="Hyperlink"/>
@@ -6825,8 +8550,8 @@
         <w:t xml:space="preserve">.</w:t>
       </w:r>
     </w:p>
-    <w:bookmarkEnd w:id="54"/>
-    <w:bookmarkStart w:id="56" w:name="ref-wikipedia_higher_order_function"/>
+    <w:bookmarkEnd w:id="65"/>
+    <w:bookmarkStart w:id="67" w:name="ref-wikipedia_higher_order_function"/>
     <w:p>
       <w:pPr>
         <w:pStyle w:val="Bibliography"/>
@@ -6885,7 +8610,7 @@
       <w:r>
         <w:t xml:space="preserve"> </w:t>
       </w:r>
-      <w:hyperlink r:id="rId55">
+      <w:hyperlink r:id="rId66">
         <w:r>
           <w:rPr>
             <w:rStyle w:val="Hyperlink"/>
@@ -6897,8 +8622,8 @@
         <w:t xml:space="preserve">.</w:t>
       </w:r>
     </w:p>
-    <w:bookmarkEnd w:id="56"/>
-    <w:bookmarkStart w:id="58" w:name="ref-wikipedia_pure_function"/>
+    <w:bookmarkEnd w:id="67"/>
+    <w:bookmarkStart w:id="69" w:name="ref-wikipedia_pure_function"/>
     <w:p>
       <w:pPr>
         <w:pStyle w:val="Bibliography"/>
@@ -6957,7 +8682,7 @@
       <w:r>
         <w:t xml:space="preserve"> </w:t>
       </w:r>
-      <w:hyperlink r:id="rId57">
+      <w:hyperlink r:id="rId68">
         <w:r>
           <w:rPr>
             <w:rStyle w:val="Hyperlink"/>
@@ -6969,9 +8694,9 @@
         <w:t xml:space="preserve">.</w:t>
       </w:r>
     </w:p>
-    <w:bookmarkEnd w:id="58"/>
-    <w:bookmarkEnd w:id="59"/>
-    <w:bookmarkEnd w:id="60"/>
+    <w:bookmarkEnd w:id="69"/>
+    <w:bookmarkEnd w:id="70"/>
+    <w:bookmarkEnd w:id="71"/>
     <w:sectPr>
       <w:footnotePr>
         <w:numRestart w:val="eachSect"/>
@@ -7583,6 +9308,69 @@
     </w:lvlOverride>
   </w:num>
   <w:num w:numId="1014">
+    <w:abstractNumId w:val="991"/>
+  </w:num>
+  <w:num w:numId="1015">
+    <w:abstractNumId w:val="99411"/>
+    <w:lvlOverride w:ilvl="0">
+      <w:startOverride w:val="1"/>
+    </w:lvlOverride>
+    <w:lvlOverride w:ilvl="1">
+      <w:startOverride w:val="1"/>
+    </w:lvlOverride>
+    <w:lvlOverride w:ilvl="2">
+      <w:startOverride w:val="1"/>
+    </w:lvlOverride>
+    <w:lvlOverride w:ilvl="3">
+      <w:startOverride w:val="1"/>
+    </w:lvlOverride>
+    <w:lvlOverride w:ilvl="4">
+      <w:startOverride w:val="1"/>
+    </w:lvlOverride>
+    <w:lvlOverride w:ilvl="5">
+      <w:startOverride w:val="1"/>
+    </w:lvlOverride>
+    <w:lvlOverride w:ilvl="6">
+      <w:startOverride w:val="1"/>
+    </w:lvlOverride>
+    <w:lvlOverride w:ilvl="7">
+      <w:startOverride w:val="1"/>
+    </w:lvlOverride>
+    <w:lvlOverride w:ilvl="8">
+      <w:startOverride w:val="1"/>
+    </w:lvlOverride>
+  </w:num>
+  <w:num w:numId="1016">
+    <w:abstractNumId w:val="99411"/>
+    <w:lvlOverride w:ilvl="0">
+      <w:startOverride w:val="1"/>
+    </w:lvlOverride>
+    <w:lvlOverride w:ilvl="1">
+      <w:startOverride w:val="1"/>
+    </w:lvlOverride>
+    <w:lvlOverride w:ilvl="2">
+      <w:startOverride w:val="1"/>
+    </w:lvlOverride>
+    <w:lvlOverride w:ilvl="3">
+      <w:startOverride w:val="1"/>
+    </w:lvlOverride>
+    <w:lvlOverride w:ilvl="4">
+      <w:startOverride w:val="1"/>
+    </w:lvlOverride>
+    <w:lvlOverride w:ilvl="5">
+      <w:startOverride w:val="1"/>
+    </w:lvlOverride>
+    <w:lvlOverride w:ilvl="6">
+      <w:startOverride w:val="1"/>
+    </w:lvlOverride>
+    <w:lvlOverride w:ilvl="7">
+      <w:startOverride w:val="1"/>
+    </w:lvlOverride>
+    <w:lvlOverride w:ilvl="8">
+      <w:startOverride w:val="1"/>
+    </w:lvlOverride>
+  </w:num>
+  <w:num w:numId="1017">
     <w:abstractNumId w:val="991"/>
   </w:num>
 </w:numbering>

</xml_diff>

<commit_message>
Deploying to gh-pages from @ Morrison-Lab/mcs@da953a8b262f1f5a9ca3687e92193c5653867d39 🚀
</commit_message>
<xml_diff>
--- a/chapters/functional-programming.docx
+++ b/chapters/functional-programming.docx
@@ -23,7 +23,7 @@
         <w:pStyle w:val="Date"/>
       </w:pPr>
       <w:r>
-        <w:t xml:space="preserve">Last modified: 2026-10-29 13:50:37 (PDT)</w:t>
+        <w:t xml:space="preserve">Last modified: 2026-10-29 14:19:01 (PDT)</w:t>
       </w:r>
     </w:p>
     <w:tbl>
@@ -5572,7 +5572,7 @@
     </w:p>
     <w:bookmarkEnd w:id="42"/>
     <w:bookmarkEnd w:id="43"/>
-    <w:bookmarkStart w:id="48" w:name="sec-functions-as-values"/>
+    <w:bookmarkStart w:id="50" w:name="sec-functions-as-values"/>
     <w:p>
       <w:pPr>
         <w:pStyle w:val="Heading1"/>
@@ -6599,48 +6599,47 @@
       </w:r>
     </w:p>
     <w:bookmarkEnd w:id="47"/>
-    <w:bookmarkEnd w:id="48"/>
-    <w:bookmarkStart w:id="56" w:name="sec-lambda-let"/>
-    <w:p>
-      <w:pPr>
-        <w:pStyle w:val="Heading1"/>
-      </w:pPr>
-      <w:r>
-        <w:t xml:space="preserve">6. Anonymous functions</w:t>
-      </w:r>
-    </w:p>
-    <w:bookmarkStart w:id="49" w:name="exr-pair-with"/>
-    <w:p>
-      <w:pPr>
-        <w:pStyle w:val="FirstParagraph"/>
+    <w:bookmarkStart w:id="48" w:name="exr-spread"/>
+    <w:p>
+      <w:pPr>
+        <w:pStyle w:val="BodyText"/>
       </w:pPr>
       <w:r>
         <w:rPr>
           <w:b/>
           <w:bCs/>
         </w:rPr>
-        <w:t xml:space="preserve">Exercise 6 (A function with no name)</w:t>
-      </w:r>
-      <w:r>
-        <w:t xml:space="preserve"> </w:t>
-      </w:r>
-      <w:r>
-        <w:t xml:space="preserve">The function</w:t>
-      </w:r>
-      <w:r>
-        <w:t xml:space="preserve"> </w:t>
-      </w:r>
-      <w:r>
-        <w:rPr>
-          <w:rStyle w:val="VerbatimChar"/>
-        </w:rPr>
-        <w:t xml:space="preserve">pair-with</w:t>
-      </w:r>
-      <w:r>
-        <w:t xml:space="preserve"> </w:t>
-      </w:r>
-      <w:r>
-        <w:t xml:space="preserve">takes a list</w:t>
+        <w:t xml:space="preserve">Exercise 6 (Applying a function to a list)</w:t>
+      </w:r>
+      <w:r>
+        <w:t xml:space="preserve"> </w:t>
+      </w:r>
+      <w:r>
+        <w:rPr>
+          <w:rStyle w:val="VerbatimChar"/>
+        </w:rPr>
+        <w:t xml:space="preserve">(apply f L)</w:t>
+      </w:r>
+      <w:r>
+        <w:t xml:space="preserve"> </w:t>
+      </w:r>
+      <w:r>
+        <w:t xml:space="preserve">applies the function</w:t>
+      </w:r>
+      <w:r>
+        <w:t xml:space="preserve"> </w:t>
+      </w:r>
+      <w:r>
+        <w:rPr>
+          <w:rStyle w:val="VerbatimChar"/>
+        </w:rPr>
+        <w:t xml:space="preserve">f</w:t>
+      </w:r>
+      <w:r>
+        <w:t xml:space="preserve"> </w:t>
+      </w:r>
+      <w:r>
+        <w:t xml:space="preserve">to the elements of the list</w:t>
       </w:r>
       <w:r>
         <w:t xml:space="preserve"> </w:t>
@@ -6655,173 +6654,40 @@
         <w:t xml:space="preserve"> </w:t>
       </w:r>
       <w:r>
-        <w:t xml:space="preserve">and a value</w:t>
-      </w:r>
-      <w:r>
-        <w:t xml:space="preserve"> </w:t>
-      </w:r>
-      <w:r>
-        <w:rPr>
-          <w:rStyle w:val="VerbatimChar"/>
-        </w:rPr>
-        <w:t xml:space="preserve">y</w:t>
-      </w:r>
-      <w:r>
-        <w:t xml:space="preserve">:</w:t>
-      </w:r>
-    </w:p>
-    <w:p>
-      <w:pPr>
-        <w:pStyle w:val="SourceCode"/>
-      </w:pPr>
-      <w:r>
-        <w:rPr>
-          <w:rStyle w:val="OperatorTok"/>
-        </w:rPr>
-        <w:t xml:space="preserve">(</w:t>
-      </w:r>
-      <w:r>
-        <w:rPr>
-          <w:rStyle w:val="ExtensionTok"/>
-        </w:rPr>
-        <w:t xml:space="preserve">define</w:t>
-      </w:r>
-      <w:r>
-        <w:rPr>
-          <w:rStyle w:val="FunctionTok"/>
-        </w:rPr>
-        <w:t xml:space="preserve"> </w:t>
-      </w:r>
-      <w:r>
-        <w:rPr>
-          <w:rStyle w:val="OperatorTok"/>
-        </w:rPr>
-        <w:t xml:space="preserve">(</w:t>
-      </w:r>
-      <w:r>
-        <w:rPr>
-          <w:rStyle w:val="NormalTok"/>
-        </w:rPr>
-        <w:t xml:space="preserve">pair-with L y</w:t>
-      </w:r>
-      <w:r>
-        <w:rPr>
-          <w:rStyle w:val="OperatorTok"/>
-        </w:rPr>
-        <w:t xml:space="preserve">)</w:t>
-      </w:r>
-      <w:r>
-        <w:br/>
-      </w:r>
-      <w:r>
-        <w:rPr>
-          <w:rStyle w:val="NormalTok"/>
-        </w:rPr>
-        <w:t xml:space="preserve">  </w:t>
-      </w:r>
-      <w:r>
-        <w:rPr>
-          <w:rStyle w:val="OperatorTok"/>
-        </w:rPr>
-        <w:t xml:space="preserve">(</w:t>
-      </w:r>
-      <w:r>
-        <w:rPr>
-          <w:rStyle w:val="KeywordTok"/>
-        </w:rPr>
-        <w:t xml:space="preserve">map</w:t>
-      </w:r>
-      <w:r>
-        <w:rPr>
-          <w:rStyle w:val="NormalTok"/>
-        </w:rPr>
-        <w:t xml:space="preserve"> </w:t>
-      </w:r>
-      <w:r>
-        <w:rPr>
-          <w:rStyle w:val="OperatorTok"/>
-        </w:rPr>
-        <w:t xml:space="preserve">(</w:t>
-      </w:r>
-      <w:r>
-        <w:rPr>
-          <w:rStyle w:val="KeywordTok"/>
-        </w:rPr>
-        <w:t xml:space="preserve">lambda</w:t>
-      </w:r>
-      <w:r>
-        <w:rPr>
-          <w:rStyle w:val="NormalTok"/>
-        </w:rPr>
-        <w:t xml:space="preserve"> </w:t>
-      </w:r>
-      <w:r>
-        <w:rPr>
-          <w:rStyle w:val="OperatorTok"/>
-        </w:rPr>
-        <w:t xml:space="preserve">(</w:t>
-      </w:r>
-      <w:r>
-        <w:rPr>
-          <w:rStyle w:val="NormalTok"/>
-        </w:rPr>
-        <w:t xml:space="preserve">x</w:t>
-      </w:r>
-      <w:r>
-        <w:rPr>
-          <w:rStyle w:val="OperatorTok"/>
-        </w:rPr>
-        <w:t xml:space="preserve">)</w:t>
-      </w:r>
-      <w:r>
-        <w:rPr>
-          <w:rStyle w:val="NormalTok"/>
-        </w:rPr>
-        <w:t xml:space="preserve"> </w:t>
-      </w:r>
-      <w:r>
-        <w:rPr>
-          <w:rStyle w:val="OperatorTok"/>
-        </w:rPr>
-        <w:t xml:space="preserve">(</w:t>
-      </w:r>
-      <w:r>
-        <w:rPr>
-          <w:rStyle w:val="KeywordTok"/>
-        </w:rPr>
-        <w:t xml:space="preserve">list</w:t>
-      </w:r>
-      <w:r>
-        <w:rPr>
-          <w:rStyle w:val="NormalTok"/>
-        </w:rPr>
-        <w:t xml:space="preserve"> x y</w:t>
-      </w:r>
-      <w:r>
-        <w:rPr>
-          <w:rStyle w:val="OperatorTok"/>
-        </w:rPr>
-        <w:t xml:space="preserve">))</w:t>
-      </w:r>
-      <w:r>
-        <w:rPr>
-          <w:rStyle w:val="NormalTok"/>
-        </w:rPr>
-        <w:t xml:space="preserve"> L</w:t>
-      </w:r>
-      <w:r>
-        <w:rPr>
-          <w:rStyle w:val="OperatorTok"/>
-        </w:rPr>
-        <w:t xml:space="preserve">))</w:t>
-      </w:r>
-    </w:p>
-    <w:p>
-      <w:pPr>
-        <w:pStyle w:val="FirstParagraph"/>
-      </w:pPr>
-      <w:r>
-        <w:t xml:space="preserve">Guess what each expression returns:</w:t>
+        <w:t xml:space="preserve">as its arguments,</w:t>
+      </w:r>
+      <w:r>
+        <w:t xml:space="preserve"> </w:t>
+      </w:r>
+      <w:r>
+        <w:t xml:space="preserve">so</w:t>
+      </w:r>
+      <w:r>
+        <w:t xml:space="preserve"> </w:t>
+      </w:r>
+      <w:r>
+        <w:rPr>
+          <w:rStyle w:val="VerbatimChar"/>
+        </w:rPr>
+        <w:t xml:space="preserve">(apply + (list 2 7 6))</w:t>
+      </w:r>
+      <w:r>
+        <w:t xml:space="preserve"> </w:t>
+      </w:r>
+      <w:r>
+        <w:t xml:space="preserve">is the same as</w:t>
+      </w:r>
+      <w:r>
+        <w:t xml:space="preserve"> </w:t>
+      </w:r>
+      <w:r>
+        <w:rPr>
+          <w:rStyle w:val="VerbatimChar"/>
+        </w:rPr>
+        <w:t xml:space="preserve">(+ 2 7 6)</w:t>
+      </w:r>
+      <w:r>
+        <w:t xml:space="preserve">, which returns 15.</w:t>
       </w:r>
     </w:p>
     <w:p>
@@ -6833,10 +6699,22 @@
         </w:numPr>
       </w:pPr>
       <w:r>
-        <w:rPr>
-          <w:rStyle w:val="VerbatimChar"/>
-        </w:rPr>
-        <w:t xml:space="preserve">((lambda (x) (* x x)) 7)</w:t>
+        <w:t xml:space="preserve">Guess what</w:t>
+      </w:r>
+      <w:r>
+        <w:t xml:space="preserve"> </w:t>
+      </w:r>
+      <w:r>
+        <w:rPr>
+          <w:rStyle w:val="VerbatimChar"/>
+        </w:rPr>
+        <w:t xml:space="preserve">(apply max (list 3 9 2))</w:t>
+      </w:r>
+      <w:r>
+        <w:t xml:space="preserve"> </w:t>
+      </w:r>
+      <w:r>
+        <w:t xml:space="preserve">returns.</w:t>
       </w:r>
     </w:p>
     <w:p>
@@ -6848,10 +6726,67 @@
         </w:numPr>
       </w:pPr>
       <w:r>
-        <w:rPr>
-          <w:rStyle w:val="VerbatimChar"/>
-        </w:rPr>
-        <w:t xml:space="preserve">(map (lambda (x) (* 2 x)) (list 1 2 3))</w:t>
+        <w:t xml:space="preserve">Use</w:t>
+      </w:r>
+      <w:r>
+        <w:t xml:space="preserve"> </w:t>
+      </w:r>
+      <w:r>
+        <w:rPr>
+          <w:rStyle w:val="VerbatimChar"/>
+        </w:rPr>
+        <w:t xml:space="preserve">apply</w:t>
+      </w:r>
+      <w:r>
+        <w:t xml:space="preserve">,</w:t>
+      </w:r>
+      <w:r>
+        <w:t xml:space="preserve"> </w:t>
+      </w:r>
+      <w:r>
+        <w:rPr>
+          <w:rStyle w:val="VerbatimChar"/>
+        </w:rPr>
+        <w:t xml:space="preserve">max</w:t>
+      </w:r>
+      <w:r>
+        <w:t xml:space="preserve"> </w:t>
+      </w:r>
+      <w:r>
+        <w:t xml:space="preserve">and</w:t>
+      </w:r>
+      <w:r>
+        <w:t xml:space="preserve"> </w:t>
+      </w:r>
+      <w:r>
+        <w:rPr>
+          <w:rStyle w:val="VerbatimChar"/>
+        </w:rPr>
+        <w:t xml:space="preserve">min</w:t>
+      </w:r>
+      <w:r>
+        <w:t xml:space="preserve"> </w:t>
+      </w:r>
+      <w:r>
+        <w:t xml:space="preserve">to define</w:t>
+      </w:r>
+      <w:r>
+        <w:t xml:space="preserve"> </w:t>
+      </w:r>
+      <w:r>
+        <w:rPr>
+          <w:rStyle w:val="VerbatimChar"/>
+        </w:rPr>
+        <w:t xml:space="preserve">(spread L)</w:t>
+      </w:r>
+      <w:r>
+        <w:t xml:space="preserve">,</w:t>
+      </w:r>
+      <w:r>
+        <w:t xml:space="preserve"> </w:t>
+      </w:r>
+      <w:r>
+        <w:t xml:space="preserve">which returns the largest element of a nonempty list of numbers minus its smallest element.</w:t>
       </w:r>
     </w:p>
     <w:p>
@@ -6863,14 +6798,26 @@
         </w:numPr>
       </w:pPr>
       <w:r>
-        <w:rPr>
-          <w:rStyle w:val="VerbatimChar"/>
-        </w:rPr>
-        <w:t xml:space="preserve">(pair-with (list 1 2 3) "a")</w:t>
-      </w:r>
-    </w:p>
-    <w:bookmarkEnd w:id="49"/>
-    <w:bookmarkStart w:id="50" w:name="sol-pair-with"/>
+        <w:t xml:space="preserve">Guess what</w:t>
+      </w:r>
+      <w:r>
+        <w:t xml:space="preserve"> </w:t>
+      </w:r>
+      <w:r>
+        <w:rPr>
+          <w:rStyle w:val="VerbatimChar"/>
+        </w:rPr>
+        <w:t xml:space="preserve">(spread (list 4 -1 7 2))</w:t>
+      </w:r>
+      <w:r>
+        <w:t xml:space="preserve"> </w:t>
+      </w:r>
+      <w:r>
+        <w:t xml:space="preserve">returns.</w:t>
+      </w:r>
+    </w:p>
+    <w:bookmarkEnd w:id="48"/>
+    <w:bookmarkStart w:id="49" w:name="sol-spread"/>
     <w:p>
       <w:pPr>
         <w:pStyle w:val="FirstParagraph"/>
@@ -6885,35 +6832,570 @@
       <w:r>
         <w:t xml:space="preserve">. </w:t>
       </w:r>
-      <w:r>
-        <w:rPr>
-          <w:rStyle w:val="VerbatimChar"/>
-        </w:rPr>
-        <w:t xml:space="preserve">(lambda (x) (* x x))</w:t>
-      </w:r>
-      <w:r>
-        <w:t xml:space="preserve"> </w:t>
-      </w:r>
-      <w:r>
-        <w:t xml:space="preserve">is the function that squares its argument,</w:t>
-      </w:r>
-      <w:r>
-        <w:t xml:space="preserve"> </w:t>
-      </w:r>
-      <w:r>
-        <w:t xml:space="preserve">written in place without a name.</w:t>
-      </w:r>
-    </w:p>
-    <w:p>
-      <w:pPr>
-        <w:pStyle w:val="Compact"/>
+    </w:p>
+    <w:p>
+      <w:pPr>
         <w:numPr>
           <w:ilvl w:val="0"/>
           <w:numId w:val="1016"/>
         </w:numPr>
       </w:pPr>
       <w:r>
-        <w:t xml:space="preserve">Applying it to 7 returns 49.</w:t>
+        <w:rPr>
+          <w:rStyle w:val="VerbatimChar"/>
+        </w:rPr>
+        <w:t xml:space="preserve">(apply max (list 3 9 2))</w:t>
+      </w:r>
+      <w:r>
+        <w:t xml:space="preserve"> </w:t>
+      </w:r>
+      <w:r>
+        <w:t xml:space="preserve">is</w:t>
+      </w:r>
+      <w:r>
+        <w:t xml:space="preserve"> </w:t>
+      </w:r>
+      <w:r>
+        <w:rPr>
+          <w:rStyle w:val="VerbatimChar"/>
+        </w:rPr>
+        <w:t xml:space="preserve">(max 3 9 2)</w:t>
+      </w:r>
+      <w:r>
+        <w:t xml:space="preserve">, which returns 9.</w:t>
+      </w:r>
+    </w:p>
+    <w:p>
+      <w:pPr>
+        <w:numPr>
+          <w:ilvl w:val="0"/>
+          <w:numId w:val="1016"/>
+        </w:numPr>
+      </w:pPr>
+      <w:r>
+        <w:t xml:space="preserve">One answer:</w:t>
+      </w:r>
+    </w:p>
+    <w:p>
+      <w:pPr>
+        <w:pStyle w:val="SourceCode"/>
+        <w:numPr>
+          <w:ilvl w:val="0"/>
+          <w:numId w:val="1000"/>
+        </w:numPr>
+      </w:pPr>
+      <w:r>
+        <w:rPr>
+          <w:rStyle w:val="OperatorTok"/>
+        </w:rPr>
+        <w:t xml:space="preserve">(</w:t>
+      </w:r>
+      <w:r>
+        <w:rPr>
+          <w:rStyle w:val="ExtensionTok"/>
+        </w:rPr>
+        <w:t xml:space="preserve">define</w:t>
+      </w:r>
+      <w:r>
+        <w:rPr>
+          <w:rStyle w:val="FunctionTok"/>
+        </w:rPr>
+        <w:t xml:space="preserve"> </w:t>
+      </w:r>
+      <w:r>
+        <w:rPr>
+          <w:rStyle w:val="OperatorTok"/>
+        </w:rPr>
+        <w:t xml:space="preserve">(</w:t>
+      </w:r>
+      <w:r>
+        <w:rPr>
+          <w:rStyle w:val="NormalTok"/>
+        </w:rPr>
+        <w:t xml:space="preserve">spread L</w:t>
+      </w:r>
+      <w:r>
+        <w:rPr>
+          <w:rStyle w:val="OperatorTok"/>
+        </w:rPr>
+        <w:t xml:space="preserve">)</w:t>
+      </w:r>
+      <w:r>
+        <w:br/>
+      </w:r>
+      <w:r>
+        <w:rPr>
+          <w:rStyle w:val="NormalTok"/>
+        </w:rPr>
+        <w:t xml:space="preserve">  </w:t>
+      </w:r>
+      <w:r>
+        <w:rPr>
+          <w:rStyle w:val="OperatorTok"/>
+        </w:rPr>
+        <w:t xml:space="preserve">(-</w:t>
+      </w:r>
+      <w:r>
+        <w:rPr>
+          <w:rStyle w:val="NormalTok"/>
+        </w:rPr>
+        <w:t xml:space="preserve"> </w:t>
+      </w:r>
+      <w:r>
+        <w:rPr>
+          <w:rStyle w:val="OperatorTok"/>
+        </w:rPr>
+        <w:t xml:space="preserve">(</w:t>
+      </w:r>
+      <w:r>
+        <w:rPr>
+          <w:rStyle w:val="KeywordTok"/>
+        </w:rPr>
+        <w:t xml:space="preserve">apply</w:t>
+      </w:r>
+      <w:r>
+        <w:rPr>
+          <w:rStyle w:val="NormalTok"/>
+        </w:rPr>
+        <w:t xml:space="preserve"> </w:t>
+      </w:r>
+      <w:r>
+        <w:rPr>
+          <w:rStyle w:val="KeywordTok"/>
+        </w:rPr>
+        <w:t xml:space="preserve">max</w:t>
+      </w:r>
+      <w:r>
+        <w:rPr>
+          <w:rStyle w:val="NormalTok"/>
+        </w:rPr>
+        <w:t xml:space="preserve"> L</w:t>
+      </w:r>
+      <w:r>
+        <w:rPr>
+          <w:rStyle w:val="OperatorTok"/>
+        </w:rPr>
+        <w:t xml:space="preserve">)</w:t>
+      </w:r>
+      <w:r>
+        <w:rPr>
+          <w:rStyle w:val="NormalTok"/>
+        </w:rPr>
+        <w:t xml:space="preserve"> </w:t>
+      </w:r>
+      <w:r>
+        <w:rPr>
+          <w:rStyle w:val="OperatorTok"/>
+        </w:rPr>
+        <w:t xml:space="preserve">(</w:t>
+      </w:r>
+      <w:r>
+        <w:rPr>
+          <w:rStyle w:val="KeywordTok"/>
+        </w:rPr>
+        <w:t xml:space="preserve">apply</w:t>
+      </w:r>
+      <w:r>
+        <w:rPr>
+          <w:rStyle w:val="NormalTok"/>
+        </w:rPr>
+        <w:t xml:space="preserve"> </w:t>
+      </w:r>
+      <w:r>
+        <w:rPr>
+          <w:rStyle w:val="KeywordTok"/>
+        </w:rPr>
+        <w:t xml:space="preserve">min</w:t>
+      </w:r>
+      <w:r>
+        <w:rPr>
+          <w:rStyle w:val="NormalTok"/>
+        </w:rPr>
+        <w:t xml:space="preserve"> L</w:t>
+      </w:r>
+      <w:r>
+        <w:rPr>
+          <w:rStyle w:val="OperatorTok"/>
+        </w:rPr>
+        <w:t xml:space="preserve">)))</w:t>
+      </w:r>
+    </w:p>
+    <w:p>
+      <w:pPr>
+        <w:numPr>
+          <w:ilvl w:val="0"/>
+          <w:numId w:val="1016"/>
+        </w:numPr>
+      </w:pPr>
+      <w:r>
+        <w:t xml:space="preserve">The largest element is 7 and the smallest is</w:t>
+      </w:r>
+      <w:r>
+        <w:t xml:space="preserve"> </w:t>
+      </w:r>
+      <m:oMath>
+        <m:r>
+          <m:rPr>
+            <m:sty m:val="p"/>
+          </m:rPr>
+          <m:t>−</m:t>
+        </m:r>
+        <m:r>
+          <m:t>1</m:t>
+        </m:r>
+      </m:oMath>
+      <w:r>
+        <w:t xml:space="preserve">, so</w:t>
+      </w:r>
+      <w:r>
+        <w:t xml:space="preserve"> </w:t>
+      </w:r>
+      <w:r>
+        <w:rPr>
+          <w:rStyle w:val="VerbatimChar"/>
+        </w:rPr>
+        <w:t xml:space="preserve">(spread (list 4 -1 7 2))</w:t>
+      </w:r>
+      <w:r>
+        <w:t xml:space="preserve"> </w:t>
+      </w:r>
+      <w:r>
+        <w:t xml:space="preserve">returns</w:t>
+      </w:r>
+      <w:r>
+        <w:t xml:space="preserve"> </w:t>
+      </w:r>
+      <m:oMath>
+        <m:r>
+          <m:t>7</m:t>
+        </m:r>
+        <m:r>
+          <m:rPr>
+            <m:sty m:val="p"/>
+          </m:rPr>
+          <m:t>−</m:t>
+        </m:r>
+        <m:r>
+          <m:rPr>
+            <m:sty m:val="p"/>
+          </m:rPr>
+          <m:t>(</m:t>
+        </m:r>
+        <m:r>
+          <m:rPr>
+            <m:sty m:val="p"/>
+          </m:rPr>
+          <m:t>−</m:t>
+        </m:r>
+        <m:r>
+          <m:t>1</m:t>
+        </m:r>
+        <m:r>
+          <m:rPr>
+            <m:sty m:val="p"/>
+          </m:rPr>
+          <m:t>)</m:t>
+        </m:r>
+        <m:r>
+          <m:rPr>
+            <m:sty m:val="p"/>
+          </m:rPr>
+          <m:t>=</m:t>
+        </m:r>
+        <m:r>
+          <m:t>8</m:t>
+        </m:r>
+      </m:oMath>
+      <w:r>
+        <w:t xml:space="preserve">.</w:t>
+      </w:r>
+    </w:p>
+    <w:p>
+      <w:pPr>
+        <w:pStyle w:val="FirstParagraph"/>
+      </w:pPr>
+      <w:r>
+        <w:rPr>
+          <w:rStyle w:val="VerbatimChar"/>
+        </w:rPr>
+        <w:t xml:space="preserve">spread</w:t>
+      </w:r>
+      <w:r>
+        <w:t xml:space="preserve"> </w:t>
+      </w:r>
+      <w:r>
+        <w:t xml:space="preserve">needs no recursion:</w:t>
+      </w:r>
+      <w:r>
+        <w:t xml:space="preserve"> </w:t>
+      </w:r>
+      <w:r>
+        <w:rPr>
+          <w:rStyle w:val="VerbatimChar"/>
+        </w:rPr>
+        <w:t xml:space="preserve">max</w:t>
+      </w:r>
+      <w:r>
+        <w:t xml:space="preserve"> </w:t>
+      </w:r>
+      <w:r>
+        <w:t xml:space="preserve">and</w:t>
+      </w:r>
+      <w:r>
+        <w:t xml:space="preserve"> </w:t>
+      </w:r>
+      <w:r>
+        <w:rPr>
+          <w:rStyle w:val="VerbatimChar"/>
+        </w:rPr>
+        <w:t xml:space="preserve">min</w:t>
+      </w:r>
+      <w:r>
+        <w:t xml:space="preserve"> </w:t>
+      </w:r>
+      <w:r>
+        <w:t xml:space="preserve">already take any number of arguments, and</w:t>
+      </w:r>
+      <w:r>
+        <w:t xml:space="preserve"> </w:t>
+      </w:r>
+      <w:r>
+        <w:rPr>
+          <w:rStyle w:val="VerbatimChar"/>
+        </w:rPr>
+        <w:t xml:space="preserve">apply</w:t>
+      </w:r>
+      <w:r>
+        <w:t xml:space="preserve"> </w:t>
+      </w:r>
+      <w:r>
+        <w:t xml:space="preserve">hands each of them the whole list.</w:t>
+      </w:r>
+    </w:p>
+    <w:bookmarkEnd w:id="49"/>
+    <w:bookmarkEnd w:id="50"/>
+    <w:bookmarkStart w:id="67" w:name="sec-lambda-let"/>
+    <w:p>
+      <w:pPr>
+        <w:pStyle w:val="Heading1"/>
+      </w:pPr>
+      <w:r>
+        <w:t xml:space="preserve">6. Anonymous functions and local names</w:t>
+      </w:r>
+    </w:p>
+    <w:bookmarkStart w:id="51" w:name="exr-pair-with"/>
+    <w:p>
+      <w:pPr>
+        <w:pStyle w:val="FirstParagraph"/>
+      </w:pPr>
+      <w:r>
+        <w:rPr>
+          <w:b/>
+          <w:bCs/>
+        </w:rPr>
+        <w:t xml:space="preserve">Exercise 7 (A function with no name)</w:t>
+      </w:r>
+      <w:r>
+        <w:t xml:space="preserve"> </w:t>
+      </w:r>
+      <w:r>
+        <w:t xml:space="preserve">The function</w:t>
+      </w:r>
+      <w:r>
+        <w:t xml:space="preserve"> </w:t>
+      </w:r>
+      <w:r>
+        <w:rPr>
+          <w:rStyle w:val="VerbatimChar"/>
+        </w:rPr>
+        <w:t xml:space="preserve">pair-with</w:t>
+      </w:r>
+      <w:r>
+        <w:t xml:space="preserve"> </w:t>
+      </w:r>
+      <w:r>
+        <w:t xml:space="preserve">takes a list</w:t>
+      </w:r>
+      <w:r>
+        <w:t xml:space="preserve"> </w:t>
+      </w:r>
+      <w:r>
+        <w:rPr>
+          <w:rStyle w:val="VerbatimChar"/>
+        </w:rPr>
+        <w:t xml:space="preserve">L</w:t>
+      </w:r>
+      <w:r>
+        <w:t xml:space="preserve"> </w:t>
+      </w:r>
+      <w:r>
+        <w:t xml:space="preserve">and a value</w:t>
+      </w:r>
+      <w:r>
+        <w:t xml:space="preserve"> </w:t>
+      </w:r>
+      <w:r>
+        <w:rPr>
+          <w:rStyle w:val="VerbatimChar"/>
+        </w:rPr>
+        <w:t xml:space="preserve">y</w:t>
+      </w:r>
+      <w:r>
+        <w:t xml:space="preserve">:</w:t>
+      </w:r>
+    </w:p>
+    <w:p>
+      <w:pPr>
+        <w:pStyle w:val="SourceCode"/>
+      </w:pPr>
+      <w:r>
+        <w:rPr>
+          <w:rStyle w:val="OperatorTok"/>
+        </w:rPr>
+        <w:t xml:space="preserve">(</w:t>
+      </w:r>
+      <w:r>
+        <w:rPr>
+          <w:rStyle w:val="ExtensionTok"/>
+        </w:rPr>
+        <w:t xml:space="preserve">define</w:t>
+      </w:r>
+      <w:r>
+        <w:rPr>
+          <w:rStyle w:val="FunctionTok"/>
+        </w:rPr>
+        <w:t xml:space="preserve"> </w:t>
+      </w:r>
+      <w:r>
+        <w:rPr>
+          <w:rStyle w:val="OperatorTok"/>
+        </w:rPr>
+        <w:t xml:space="preserve">(</w:t>
+      </w:r>
+      <w:r>
+        <w:rPr>
+          <w:rStyle w:val="NormalTok"/>
+        </w:rPr>
+        <w:t xml:space="preserve">pair-with L y</w:t>
+      </w:r>
+      <w:r>
+        <w:rPr>
+          <w:rStyle w:val="OperatorTok"/>
+        </w:rPr>
+        <w:t xml:space="preserve">)</w:t>
+      </w:r>
+      <w:r>
+        <w:br/>
+      </w:r>
+      <w:r>
+        <w:rPr>
+          <w:rStyle w:val="NormalTok"/>
+        </w:rPr>
+        <w:t xml:space="preserve">  </w:t>
+      </w:r>
+      <w:r>
+        <w:rPr>
+          <w:rStyle w:val="OperatorTok"/>
+        </w:rPr>
+        <w:t xml:space="preserve">(</w:t>
+      </w:r>
+      <w:r>
+        <w:rPr>
+          <w:rStyle w:val="KeywordTok"/>
+        </w:rPr>
+        <w:t xml:space="preserve">map</w:t>
+      </w:r>
+      <w:r>
+        <w:rPr>
+          <w:rStyle w:val="NormalTok"/>
+        </w:rPr>
+        <w:t xml:space="preserve"> </w:t>
+      </w:r>
+      <w:r>
+        <w:rPr>
+          <w:rStyle w:val="OperatorTok"/>
+        </w:rPr>
+        <w:t xml:space="preserve">(</w:t>
+      </w:r>
+      <w:r>
+        <w:rPr>
+          <w:rStyle w:val="KeywordTok"/>
+        </w:rPr>
+        <w:t xml:space="preserve">lambda</w:t>
+      </w:r>
+      <w:r>
+        <w:rPr>
+          <w:rStyle w:val="NormalTok"/>
+        </w:rPr>
+        <w:t xml:space="preserve"> </w:t>
+      </w:r>
+      <w:r>
+        <w:rPr>
+          <w:rStyle w:val="OperatorTok"/>
+        </w:rPr>
+        <w:t xml:space="preserve">(</w:t>
+      </w:r>
+      <w:r>
+        <w:rPr>
+          <w:rStyle w:val="NormalTok"/>
+        </w:rPr>
+        <w:t xml:space="preserve">x</w:t>
+      </w:r>
+      <w:r>
+        <w:rPr>
+          <w:rStyle w:val="OperatorTok"/>
+        </w:rPr>
+        <w:t xml:space="preserve">)</w:t>
+      </w:r>
+      <w:r>
+        <w:rPr>
+          <w:rStyle w:val="NormalTok"/>
+        </w:rPr>
+        <w:t xml:space="preserve"> </w:t>
+      </w:r>
+      <w:r>
+        <w:rPr>
+          <w:rStyle w:val="OperatorTok"/>
+        </w:rPr>
+        <w:t xml:space="preserve">(</w:t>
+      </w:r>
+      <w:r>
+        <w:rPr>
+          <w:rStyle w:val="KeywordTok"/>
+        </w:rPr>
+        <w:t xml:space="preserve">list</w:t>
+      </w:r>
+      <w:r>
+        <w:rPr>
+          <w:rStyle w:val="NormalTok"/>
+        </w:rPr>
+        <w:t xml:space="preserve"> x y</w:t>
+      </w:r>
+      <w:r>
+        <w:rPr>
+          <w:rStyle w:val="OperatorTok"/>
+        </w:rPr>
+        <w:t xml:space="preserve">))</w:t>
+      </w:r>
+      <w:r>
+        <w:rPr>
+          <w:rStyle w:val="NormalTok"/>
+        </w:rPr>
+        <w:t xml:space="preserve"> L</w:t>
+      </w:r>
+      <w:r>
+        <w:rPr>
+          <w:rStyle w:val="OperatorTok"/>
+        </w:rPr>
+        <w:t xml:space="preserve">))</w:t>
+      </w:r>
+    </w:p>
+    <w:p>
+      <w:pPr>
+        <w:pStyle w:val="FirstParagraph"/>
+      </w:pPr>
+      <w:r>
+        <w:t xml:space="preserve">Guess what each expression returns:</w:t>
       </w:r>
     </w:p>
     <w:p>
@@ -6921,7 +7403,99 @@
         <w:pStyle w:val="Compact"/>
         <w:numPr>
           <w:ilvl w:val="0"/>
-          <w:numId w:val="1016"/>
+          <w:numId w:val="1017"/>
+        </w:numPr>
+      </w:pPr>
+      <w:r>
+        <w:rPr>
+          <w:rStyle w:val="VerbatimChar"/>
+        </w:rPr>
+        <w:t xml:space="preserve">((lambda (x) (* x x)) 7)</w:t>
+      </w:r>
+    </w:p>
+    <w:p>
+      <w:pPr>
+        <w:pStyle w:val="Compact"/>
+        <w:numPr>
+          <w:ilvl w:val="0"/>
+          <w:numId w:val="1017"/>
+        </w:numPr>
+      </w:pPr>
+      <w:r>
+        <w:rPr>
+          <w:rStyle w:val="VerbatimChar"/>
+        </w:rPr>
+        <w:t xml:space="preserve">(map (lambda (x) (* 2 x)) (list 1 2 3))</w:t>
+      </w:r>
+    </w:p>
+    <w:p>
+      <w:pPr>
+        <w:pStyle w:val="Compact"/>
+        <w:numPr>
+          <w:ilvl w:val="0"/>
+          <w:numId w:val="1017"/>
+        </w:numPr>
+      </w:pPr>
+      <w:r>
+        <w:rPr>
+          <w:rStyle w:val="VerbatimChar"/>
+        </w:rPr>
+        <w:t xml:space="preserve">(pair-with (list 1 2 3) "a")</w:t>
+      </w:r>
+    </w:p>
+    <w:bookmarkEnd w:id="51"/>
+    <w:bookmarkStart w:id="52" w:name="sol-pair-with"/>
+    <w:p>
+      <w:pPr>
+        <w:pStyle w:val="FirstParagraph"/>
+      </w:pPr>
+      <w:r>
+        <w:rPr>
+          <w:i/>
+          <w:iCs/>
+        </w:rPr>
+        <w:t xml:space="preserve">Solution 7</w:t>
+      </w:r>
+      <w:r>
+        <w:t xml:space="preserve">. </w:t>
+      </w:r>
+      <w:r>
+        <w:rPr>
+          <w:rStyle w:val="VerbatimChar"/>
+        </w:rPr>
+        <w:t xml:space="preserve">(lambda (x) (* x x))</w:t>
+      </w:r>
+      <w:r>
+        <w:t xml:space="preserve"> </w:t>
+      </w:r>
+      <w:r>
+        <w:t xml:space="preserve">is the function that squares its argument,</w:t>
+      </w:r>
+      <w:r>
+        <w:t xml:space="preserve"> </w:t>
+      </w:r>
+      <w:r>
+        <w:t xml:space="preserve">written in place without a name.</w:t>
+      </w:r>
+    </w:p>
+    <w:p>
+      <w:pPr>
+        <w:pStyle w:val="Compact"/>
+        <w:numPr>
+          <w:ilvl w:val="0"/>
+          <w:numId w:val="1018"/>
+        </w:numPr>
+      </w:pPr>
+      <w:r>
+        <w:t xml:space="preserve">Applying it to 7 returns 49.</w:t>
+      </w:r>
+    </w:p>
+    <w:p>
+      <w:pPr>
+        <w:pStyle w:val="Compact"/>
+        <w:numPr>
+          <w:ilvl w:val="0"/>
+          <w:numId w:val="1018"/>
         </w:numPr>
       </w:pPr>
       <w:r>
@@ -6965,7 +7539,7 @@
         <w:pStyle w:val="Compact"/>
         <w:numPr>
           <w:ilvl w:val="0"/>
-          <w:numId w:val="1016"/>
+          <w:numId w:val="1018"/>
         </w:numPr>
       </w:pPr>
       <w:r>
@@ -7098,8 +7672,8 @@
         <w:t xml:space="preserve">.</w:t>
       </w:r>
     </w:p>
-    <w:bookmarkEnd w:id="50"/>
-    <w:bookmarkStart w:id="52" w:name="def-lambda"/>
+    <w:bookmarkEnd w:id="52"/>
+    <w:bookmarkStart w:id="54" w:name="def-lambda"/>
     <w:p>
       <w:pPr>
         <w:pStyle w:val="FirstParagraph"/>
@@ -7357,7 +7931,7 @@
           <w:rPr>
             <w:rStyle w:val="Hyperlink"/>
           </w:rPr>
-          <w:t xml:space="preserve">Exercise 6</w:t>
+          <w:t xml:space="preserve">Exercise 7</w:t>
         </w:r>
       </w:hyperlink>
       <w:r>
@@ -7497,7 +8071,7 @@
       <w:r>
         <w:t xml:space="preserve"> </w:t>
       </w:r>
-      <w:hyperlink r:id="rId51">
+      <w:hyperlink r:id="rId53">
         <w:r>
           <w:rPr>
             <w:rStyle w:val="Hyperlink"/>
@@ -7515,8 +8089,8 @@
         <w:t xml:space="preserve">.</w:t>
       </w:r>
     </w:p>
-    <w:bookmarkEnd w:id="52"/>
-    <w:bookmarkStart w:id="54" w:name="rem-lambda-calculus"/>
+    <w:bookmarkEnd w:id="54"/>
+    <w:bookmarkStart w:id="56" w:name="rem-lambda-calculus"/>
     <w:p>
       <w:pPr>
         <w:pStyle w:val="BodyText"/>
@@ -7733,7 +8307,7 @@
           <w:rPr>
             <w:rStyle w:val="Hyperlink"/>
           </w:rPr>
-          <w:t xml:space="preserve">Exercise 6</w:t>
+          <w:t xml:space="preserve">Exercise 7</w:t>
         </w:r>
       </w:hyperlink>
       <w:r>
@@ -7798,7 +8372,7 @@
       <w:r>
         <w:t xml:space="preserve"> </w:t>
       </w:r>
-      <w:hyperlink r:id="rId53">
+      <w:hyperlink r:id="rId55">
         <w:r>
           <w:rPr>
             <w:rStyle w:val="Hyperlink"/>
@@ -7832,8 +8406,8 @@
         <w:t xml:space="preserve">.</w:t>
       </w:r>
     </w:p>
-    <w:bookmarkEnd w:id="54"/>
-    <w:bookmarkStart w:id="55" w:name="exm-adder"/>
+    <w:bookmarkEnd w:id="56"/>
+    <w:bookmarkStart w:id="57" w:name="exm-adder"/>
     <w:p>
       <w:pPr>
         <w:pStyle w:val="BodyText"/>
@@ -8111,7 +8685,7 @@
         <w:pStyle w:val="Compact"/>
         <w:numPr>
           <w:ilvl w:val="0"/>
-          <w:numId w:val="1017"/>
+          <w:numId w:val="1019"/>
         </w:numPr>
       </w:pPr>
       <w:r>
@@ -8132,7 +8706,7 @@
         <w:pStyle w:val="Compact"/>
         <w:numPr>
           <w:ilvl w:val="0"/>
-          <w:numId w:val="1017"/>
+          <w:numId w:val="1019"/>
         </w:numPr>
       </w:pPr>
       <w:r>
@@ -8179,7 +8753,7 @@
         <w:pStyle w:val="Compact"/>
         <w:numPr>
           <w:ilvl w:val="0"/>
-          <w:numId w:val="1017"/>
+          <w:numId w:val="1019"/>
         </w:numPr>
       </w:pPr>
       <w:r>
@@ -8207,106 +8781,1278 @@
         <w:t xml:space="preserve">.</w:t>
       </w:r>
     </w:p>
-    <w:bookmarkEnd w:id="55"/>
-    <w:bookmarkEnd w:id="56"/>
-    <w:bookmarkStart w:id="71" w:name="references"/>
-    <w:p>
-      <w:pPr>
-        <w:pStyle w:val="Heading1"/>
-      </w:pPr>
-      <w:r>
-        <w:t xml:space="preserve">References</w:t>
-      </w:r>
-    </w:p>
-    <w:bookmarkStart w:id="70" w:name="refs"/>
-    <w:bookmarkStart w:id="57" w:name="ref-cain2008cs107videos"/>
-    <w:p>
-      <w:pPr>
-        <w:pStyle w:val="Bibliography"/>
-      </w:pPr>
-      <w:r>
-        <w:t xml:space="preserve">Cain, Jerry. 2008.</w:t>
-      </w:r>
-      <w:r>
-        <w:t xml:space="preserve"> </w:t>
-      </w:r>
-      <w:r>
-        <w:rPr>
-          <w:i/>
-          <w:iCs/>
-        </w:rPr>
-        <w:t xml:space="preserve">Programming Paradigms (</w:t>
-      </w:r>
-      <w:r>
-        <w:rPr>
-          <w:i/>
-          <w:iCs/>
-        </w:rPr>
-        <w:t xml:space="preserve">Stanford</w:t>
-      </w:r>
-      <w:r>
-        <w:rPr>
-          <w:i/>
-          <w:iCs/>
-        </w:rPr>
-        <w:t xml:space="preserve"> </w:t>
-      </w:r>
-      <w:r>
-        <w:rPr>
-          <w:i/>
-          <w:iCs/>
-        </w:rPr>
-        <w:t xml:space="preserve">CS107</w:t>
-      </w:r>
-      <w:r>
-        <w:rPr>
-          <w:i/>
-          <w:iCs/>
-        </w:rPr>
-        <w:t xml:space="preserve">), Lecture 22</w:t>
-      </w:r>
-      <w:r>
-        <w:t xml:space="preserve">. YouTube.</w:t>
-      </w:r>
-      <w:r>
-        <w:t xml:space="preserve"> </w:t>
-      </w:r>
-      <w:hyperlink r:id="rId51">
+    <w:bookmarkEnd w:id="57"/>
+    <w:bookmarkStart w:id="58" w:name="def-let"/>
+    <w:p>
+      <w:pPr>
+        <w:pStyle w:val="FirstParagraph"/>
+      </w:pPr>
+      <w:r>
+        <w:rPr>
+          <w:b/>
+          <w:bCs/>
+        </w:rPr>
+        <w:t xml:space="preserve">Definition 14 (</w:t>
+      </w:r>
+      <w:r>
+        <w:rPr>
+          <w:rStyle w:val="VerbatimChar"/>
+          <w:b/>
+          <w:bCs/>
+        </w:rPr>
+        <w:t xml:space="preserve">let</w:t>
+      </w:r>
+      <w:r>
+        <w:rPr>
+          <w:b/>
+          <w:bCs/>
+        </w:rPr>
+        <w:t xml:space="preserve">)</w:t>
+      </w:r>
+      <w:r>
+        <w:t xml:space="preserve"> </w:t>
+      </w:r>
+      <w:r>
+        <w:t xml:space="preserve">The Racket expression</w:t>
+      </w:r>
+    </w:p>
+    <w:p>
+      <w:pPr>
+        <w:pStyle w:val="SourceCode"/>
+      </w:pPr>
+      <w:r>
+        <w:rPr>
+          <w:rStyle w:val="OperatorTok"/>
+        </w:rPr>
+        <w:t xml:space="preserve">(</w:t>
+      </w:r>
+      <w:r>
+        <w:rPr>
+          <w:rStyle w:val="KeywordTok"/>
+        </w:rPr>
+        <w:t xml:space="preserve">let</w:t>
+      </w:r>
+      <w:r>
+        <w:rPr>
+          <w:rStyle w:val="NormalTok"/>
+        </w:rPr>
+        <w:t xml:space="preserve"> </w:t>
+      </w:r>
+      <w:r>
+        <w:rPr>
+          <w:rStyle w:val="OperatorTok"/>
+        </w:rPr>
+        <w:t xml:space="preserve">([</w:t>
+      </w:r>
+      <w:r>
+        <w:rPr>
+          <w:rStyle w:val="NormalTok"/>
+        </w:rPr>
+        <w:t xml:space="preserve">name1 e1</w:t>
+      </w:r>
+      <w:r>
+        <w:rPr>
+          <w:rStyle w:val="OperatorTok"/>
+        </w:rPr>
+        <w:t xml:space="preserve">]</w:t>
+      </w:r>
+      <w:r>
+        <w:br/>
+      </w:r>
+      <w:r>
+        <w:rPr>
+          <w:rStyle w:val="NormalTok"/>
+        </w:rPr>
+        <w:t xml:space="preserve">      ...</w:t>
+      </w:r>
+      <w:r>
+        <w:br/>
+      </w:r>
+      <w:r>
+        <w:rPr>
+          <w:rStyle w:val="NormalTok"/>
+        </w:rPr>
+        <w:t xml:space="preserve">      </w:t>
+      </w:r>
+      <w:r>
+        <w:rPr>
+          <w:rStyle w:val="OperatorTok"/>
+        </w:rPr>
+        <w:t xml:space="preserve">[</w:t>
+      </w:r>
+      <w:r>
+        <w:rPr>
+          <w:rStyle w:val="NormalTok"/>
+        </w:rPr>
+        <w:t xml:space="preserve">namen en</w:t>
+      </w:r>
+      <w:r>
+        <w:rPr>
+          <w:rStyle w:val="OperatorTok"/>
+        </w:rPr>
+        <w:t xml:space="preserve">])</w:t>
+      </w:r>
+      <w:r>
+        <w:br/>
+      </w:r>
+      <w:r>
+        <w:rPr>
+          <w:rStyle w:val="NormalTok"/>
+        </w:rPr>
+        <w:t xml:space="preserve">  body</w:t>
+      </w:r>
+      <w:r>
+        <w:rPr>
+          <w:rStyle w:val="OperatorTok"/>
+        </w:rPr>
+        <w:t xml:space="preserve">)</w:t>
+      </w:r>
+    </w:p>
+    <w:p>
+      <w:pPr>
+        <w:pStyle w:val="FirstParagraph"/>
+      </w:pPr>
+      <w:r>
+        <w:t xml:space="preserve">evaluates</w:t>
+      </w:r>
+      <w:r>
+        <w:t xml:space="preserve"> </w:t>
+      </w:r>
+      <w:r>
+        <w:rPr>
+          <w:rStyle w:val="VerbatimChar"/>
+        </w:rPr>
+        <w:t xml:space="preserve">e1</w:t>
+      </w:r>
+      <w:r>
+        <w:t xml:space="preserve">, …,</w:t>
+      </w:r>
+      <w:r>
+        <w:t xml:space="preserve"> </w:t>
+      </w:r>
+      <w:r>
+        <w:rPr>
+          <w:rStyle w:val="VerbatimChar"/>
+        </w:rPr>
+        <w:t xml:space="preserve">en</w:t>
+      </w:r>
+      <w:r>
+        <w:t xml:space="preserve">,</w:t>
+      </w:r>
+      <w:r>
+        <w:t xml:space="preserve"> </w:t>
+      </w:r>
+      <w:r>
+        <w:t xml:space="preserve">gives each value its name,</w:t>
+      </w:r>
+      <w:r>
+        <w:t xml:space="preserve"> </w:t>
+      </w:r>
+      <w:r>
+        <w:t xml:space="preserve">and returns the value of</w:t>
+      </w:r>
+      <w:r>
+        <w:t xml:space="preserve"> </w:t>
+      </w:r>
+      <w:r>
+        <w:rPr>
+          <w:rStyle w:val="VerbatimChar"/>
+        </w:rPr>
+        <w:t xml:space="preserve">body</w:t>
+      </w:r>
+      <w:r>
+        <w:t xml:space="preserve">, which can use those names.</w:t>
+      </w:r>
+      <w:r>
+        <w:t xml:space="preserve"> </w:t>
+      </w:r>
+      <w:r>
+        <w:t xml:space="preserve">The names last only inside</w:t>
+      </w:r>
+      <w:r>
+        <w:t xml:space="preserve"> </w:t>
+      </w:r>
+      <w:r>
+        <w:rPr>
+          <w:rStyle w:val="VerbatimChar"/>
+        </w:rPr>
+        <w:t xml:space="preserve">body</w:t>
+      </w:r>
+      <w:r>
+        <w:t xml:space="preserve">.</w:t>
+      </w:r>
+    </w:p>
+    <w:p>
+      <w:pPr>
+        <w:pStyle w:val="BodyText"/>
+      </w:pPr>
+      <w:r>
+        <w:t xml:space="preserve">A</w:t>
+      </w:r>
+      <w:r>
+        <w:t xml:space="preserve"> </w:t>
+      </w:r>
+      <w:r>
+        <w:rPr>
+          <w:rStyle w:val="VerbatimChar"/>
+        </w:rPr>
+        <w:t xml:space="preserve">let</w:t>
+      </w:r>
+      <w:r>
+        <w:t xml:space="preserve"> </w:t>
+      </w:r>
+      <w:r>
+        <w:t xml:space="preserve">expression is shorthand for applying a</w:t>
+      </w:r>
+      <w:r>
+        <w:t xml:space="preserve"> </w:t>
+      </w:r>
+      <w:r>
+        <w:rPr>
+          <w:rStyle w:val="VerbatimChar"/>
+        </w:rPr>
+        <w:t xml:space="preserve">lambda</w:t>
+      </w:r>
+      <w:r>
+        <w:t xml:space="preserve"> </w:t>
+      </w:r>
+      <w:r>
+        <w:t xml:space="preserve">expression (</w:t>
+      </w:r>
+      <w:hyperlink w:anchor="def-lambda">
         <w:r>
           <w:rPr>
             <w:rStyle w:val="Hyperlink"/>
           </w:rPr>
-          <w:t xml:space="preserve">https://www.youtube.com/watch?v=3LeCydausnk</w:t>
+          <w:t xml:space="preserve">Definition 13</w:t>
         </w:r>
       </w:hyperlink>
       <w:r>
+        <w:t xml:space="preserve">):</w:t>
+      </w:r>
+      <w:r>
+        <w:t xml:space="preserve"> </w:t>
+      </w:r>
+      <w:r>
+        <w:t xml:space="preserve">it has the same value as</w:t>
+      </w:r>
+      <w:r>
+        <w:t xml:space="preserve"> </w:t>
+      </w:r>
+      <w:r>
+        <w:rPr>
+          <w:rStyle w:val="VerbatimChar"/>
+        </w:rPr>
+        <w:t xml:space="preserve">((lambda (name1 ... namen) body) e1 ... en)</w:t>
+      </w:r>
+      <w:r>
         <w:t xml:space="preserve">.</w:t>
       </w:r>
-    </w:p>
-    <w:bookmarkEnd w:id="57"/>
-    <w:bookmarkStart w:id="59" w:name="ref-crichton2019cs242"/>
-    <w:p>
-      <w:pPr>
-        <w:pStyle w:val="Bibliography"/>
-      </w:pPr>
-      <w:r>
-        <w:t xml:space="preserve">Crichton, Will. 2019.</w:t>
-      </w:r>
-      <w:r>
-        <w:t xml:space="preserve"> </w:t>
-      </w:r>
+      <w:r>
+        <w:t xml:space="preserve"> </w:t>
+      </w:r>
+      <w:r>
+        <w:t xml:space="preserve">So</w:t>
+      </w:r>
+      <w:r>
+        <w:t xml:space="preserve"> </w:t>
+      </w:r>
+      <w:r>
+        <w:rPr>
+          <w:rStyle w:val="VerbatimChar"/>
+        </w:rPr>
+        <w:t xml:space="preserve">(let ([s (+ 1 2)]) (* s s))</w:t>
+      </w:r>
+      <w:r>
+        <w:t xml:space="preserve"> </w:t>
+      </w:r>
+      <w:r>
+        <w:t xml:space="preserve">and</w:t>
+      </w:r>
+      <w:r>
+        <w:t xml:space="preserve"> </w:t>
+      </w:r>
+      <w:r>
+        <w:rPr>
+          <w:rStyle w:val="VerbatimChar"/>
+        </w:rPr>
+        <w:t xml:space="preserve">((lambda (s) (* s s)) (+ 1 2))</w:t>
+      </w:r>
+      <w:r>
+        <w:t xml:space="preserve"> </w:t>
+      </w:r>
+      <w:r>
+        <w:t xml:space="preserve">both return 9.</w:t>
+      </w:r>
+    </w:p>
+    <w:p>
+      <w:pPr>
+        <w:pStyle w:val="BodyText"/>
+      </w:pPr>
       <w:r>
         <w:rPr>
           <w:i/>
           <w:iCs/>
         </w:rPr>
-        <w:t xml:space="preserve">CS</w:t>
-      </w:r>
+        <w:t xml:space="preserve">Video:</w:t>
+      </w:r>
+      <w:r>
+        <w:t xml:space="preserve"> </w:t>
+      </w:r>
+      <w:r>
+        <w:t xml:space="preserve">Cain uses</w:t>
+      </w:r>
+      <w:r>
+        <w:t xml:space="preserve"> </w:t>
+      </w:r>
+      <w:r>
+        <w:rPr>
+          <w:rStyle w:val="VerbatimChar"/>
+        </w:rPr>
+        <w:t xml:space="preserve">let</w:t>
+      </w:r>
+      <w:r>
+        <w:t xml:space="preserve"> </w:t>
+      </w:r>
+      <w:r>
+        <w:t xml:space="preserve">to save a result that would otherwise be computed twice, and shows how</w:t>
+      </w:r>
+      <w:r>
+        <w:t xml:space="preserve"> </w:t>
+      </w:r>
+      <w:r>
+        <w:rPr>
+          <w:rStyle w:val="VerbatimChar"/>
+        </w:rPr>
+        <w:t xml:space="preserve">let</w:t>
+      </w:r>
+      <w:r>
+        <w:t xml:space="preserve"> </w:t>
+      </w:r>
+      <w:r>
+        <w:t xml:space="preserve">becomes a</w:t>
+      </w:r>
+      <w:r>
+        <w:t xml:space="preserve"> </w:t>
+      </w:r>
+      <w:r>
+        <w:rPr>
+          <w:rStyle w:val="VerbatimChar"/>
+        </w:rPr>
+        <w:t xml:space="preserve">lambda</w:t>
+      </w:r>
+      <w:r>
+        <w:t xml:space="preserve">, in</w:t>
+      </w:r>
+      <w:r>
+        <w:t xml:space="preserve"> </w:t>
+      </w:r>
+      <w:hyperlink r:id="rId53">
+        <w:r>
+          <w:rPr>
+            <w:rStyle w:val="Hyperlink"/>
+          </w:rPr>
+          <w:t xml:space="preserve">CS 107 Lecture 22</w:t>
+        </w:r>
+      </w:hyperlink>
+      <w:r>
+        <w:t xml:space="preserve"> </w:t>
+      </w:r>
+      <w:r>
+        <w:t xml:space="preserve">(Cain 2008)</w:t>
+      </w:r>
+      <w:r>
+        <w:t xml:space="preserve">.</w:t>
+      </w:r>
+    </w:p>
+    <w:bookmarkEnd w:id="58"/>
+    <w:bookmarkStart w:id="59" w:name="exm-quadratic-roots"/>
+    <w:p>
+      <w:pPr>
+        <w:pStyle w:val="BodyText"/>
+      </w:pPr>
+      <w:r>
+        <w:rPr>
+          <w:b/>
+          <w:bCs/>
+        </w:rPr>
+        <w:t xml:space="preserve">Example 5 (Naming a value used twice)</w:t>
+      </w:r>
+      <w:r>
+        <w:t xml:space="preserve"> </w:t>
+      </w:r>
+      <w:r>
+        <w:t xml:space="preserve">The solutions of</w:t>
+      </w:r>
+      <w:r>
+        <w:t xml:space="preserve"> </w:t>
+      </w:r>
+      <m:oMath>
+        <m:r>
+          <m:t>a</m:t>
+        </m:r>
+        <m:sSup>
+          <m:e>
+            <m:r>
+              <m:t>x</m:t>
+            </m:r>
+          </m:e>
+          <m:sup>
+            <m:r>
+              <m:t>2</m:t>
+            </m:r>
+          </m:sup>
+        </m:sSup>
+        <m:r>
+          <m:rPr>
+            <m:sty m:val="p"/>
+          </m:rPr>
+          <m:t>+</m:t>
+        </m:r>
+        <m:r>
+          <m:t>b</m:t>
+        </m:r>
+        <m:r>
+          <m:t>x</m:t>
+        </m:r>
+        <m:r>
+          <m:rPr>
+            <m:sty m:val="p"/>
+          </m:rPr>
+          <m:t>+</m:t>
+        </m:r>
+        <m:r>
+          <m:t>c</m:t>
+        </m:r>
+        <m:r>
+          <m:rPr>
+            <m:sty m:val="p"/>
+          </m:rPr>
+          <m:t>=</m:t>
+        </m:r>
+        <m:r>
+          <m:t>0</m:t>
+        </m:r>
+      </m:oMath>
+      <w:r>
+        <w:t xml:space="preserve"> </w:t>
+      </w:r>
+      <w:r>
+        <w:t xml:space="preserve">with</w:t>
+      </w:r>
+      <w:r>
+        <w:t xml:space="preserve"> </w:t>
+      </w:r>
+      <m:oMath>
+        <m:r>
+          <m:t>a</m:t>
+        </m:r>
+        <m:r>
+          <m:rPr>
+            <m:sty m:val="p"/>
+          </m:rPr>
+          <m:t>≠</m:t>
+        </m:r>
+        <m:r>
+          <m:t>0</m:t>
+        </m:r>
+      </m:oMath>
+      <w:r>
+        <w:t xml:space="preserve"> </w:t>
+      </w:r>
+      <w:r>
+        <w:t xml:space="preserve">and</w:t>
+      </w:r>
+      <w:r>
+        <w:t xml:space="preserve"> </w:t>
+      </w:r>
+      <m:oMath>
+        <m:sSup>
+          <m:e>
+            <m:r>
+              <m:t>b</m:t>
+            </m:r>
+          </m:e>
+          <m:sup>
+            <m:r>
+              <m:t>2</m:t>
+            </m:r>
+          </m:sup>
+        </m:sSup>
+        <m:r>
+          <m:rPr>
+            <m:sty m:val="p"/>
+          </m:rPr>
+          <m:t>−</m:t>
+        </m:r>
+        <m:r>
+          <m:t>4</m:t>
+        </m:r>
+        <m:r>
+          <m:t>a</m:t>
+        </m:r>
+        <m:r>
+          <m:t>c</m:t>
+        </m:r>
+        <m:r>
+          <m:rPr>
+            <m:sty m:val="p"/>
+          </m:rPr>
+          <m:t>≥</m:t>
+        </m:r>
+        <m:r>
+          <m:t>0</m:t>
+        </m:r>
+      </m:oMath>
+      <w:r>
+        <w:t xml:space="preserve"> </w:t>
+      </w:r>
+      <w:r>
+        <w:t xml:space="preserve">are</w:t>
+      </w:r>
+    </w:p>
+    <w:p>
+      <w:pPr>
+        <w:pStyle w:val="BodyText"/>
+      </w:pPr>
+      <m:oMathPara>
+        <m:oMathParaPr>
+          <m:jc m:val="center"/>
+        </m:oMathParaPr>
+        <m:oMath>
+          <m:r>
+            <m:t>x</m:t>
+          </m:r>
+          <m:r>
+            <m:rPr>
+              <m:sty m:val="p"/>
+            </m:rPr>
+            <m:t>=</m:t>
+          </m:r>
+          <m:f>
+            <m:fPr>
+              <m:type m:val="bar"/>
+            </m:fPr>
+            <m:num>
+              <m:r>
+                <m:rPr>
+                  <m:sty m:val="p"/>
+                </m:rPr>
+                <m:t>−</m:t>
+              </m:r>
+              <m:r>
+                <m:t>b</m:t>
+              </m:r>
+              <m:r>
+                <m:rPr>
+                  <m:sty m:val="p"/>
+                </m:rPr>
+                <m:t>±</m:t>
+              </m:r>
+              <m:r>
+                <m:t>s</m:t>
+              </m:r>
+            </m:num>
+            <m:den>
+              <m:r>
+                <m:t>2</m:t>
+              </m:r>
+              <m:r>
+                <m:t>a</m:t>
+              </m:r>
+            </m:den>
+          </m:f>
+          <m:r>
+            <m:rPr>
+              <m:sty m:val="p"/>
+            </m:rPr>
+            <m:t>,</m:t>
+          </m:r>
+          <m:r>
+            <m:t>  </m:t>
+          </m:r>
+          <m:r>
+            <m:rPr>
+              <m:nor/>
+              <m:sty m:val="p"/>
+            </m:rPr>
+            <m:t>where </m:t>
+          </m:r>
+          <m:r>
+            <m:t>s</m:t>
+          </m:r>
+          <m:r>
+            <m:rPr>
+              <m:sty m:val="p"/>
+            </m:rPr>
+            <m:t>=</m:t>
+          </m:r>
+          <m:rad>
+            <m:radPr>
+              <m:degHide m:val="on"/>
+            </m:radPr>
+            <m:deg/>
+            <m:e>
+              <m:sSup>
+                <m:e>
+                  <m:r>
+                    <m:t>b</m:t>
+                  </m:r>
+                </m:e>
+                <m:sup>
+                  <m:r>
+                    <m:t>2</m:t>
+                  </m:r>
+                </m:sup>
+              </m:sSup>
+              <m:r>
+                <m:rPr>
+                  <m:sty m:val="p"/>
+                </m:rPr>
+                <m:t>−</m:t>
+              </m:r>
+              <m:r>
+                <m:t>4</m:t>
+              </m:r>
+              <m:r>
+                <m:t>a</m:t>
+              </m:r>
+              <m:r>
+                <m:t>c</m:t>
+              </m:r>
+            </m:e>
+          </m:rad>
+          <m:r>
+            <m:rPr>
+              <m:sty m:val="p"/>
+            </m:rPr>
+            <m:t>.</m:t>
+          </m:r>
+        </m:oMath>
+      </m:oMathPara>
+    </w:p>
+    <w:p>
+      <w:pPr>
+        <w:pStyle w:val="FirstParagraph"/>
+      </w:pPr>
+      <w:r>
+        <w:t xml:space="preserve">Both solutions use</w:t>
+      </w:r>
+      <w:r>
+        <w:t xml:space="preserve"> </w:t>
+      </w:r>
+      <m:oMath>
+        <m:r>
+          <m:t>s</m:t>
+        </m:r>
+      </m:oMath>
+      <w:r>
+        <w:t xml:space="preserve">, so a</w:t>
+      </w:r>
+      <w:r>
+        <w:t xml:space="preserve"> </w:t>
+      </w:r>
+      <w:r>
+        <w:rPr>
+          <w:rStyle w:val="VerbatimChar"/>
+        </w:rPr>
+        <w:t xml:space="preserve">let</w:t>
+      </w:r>
+      <w:r>
+        <w:t xml:space="preserve"> </w:t>
+      </w:r>
+      <w:r>
+        <w:t xml:space="preserve">names it and computes it once:</w:t>
+      </w:r>
+    </w:p>
+    <w:p>
+      <w:pPr>
+        <w:pStyle w:val="SourceCode"/>
+      </w:pPr>
+      <w:r>
+        <w:rPr>
+          <w:rStyle w:val="OperatorTok"/>
+        </w:rPr>
+        <w:t xml:space="preserve">(</w:t>
+      </w:r>
+      <w:r>
+        <w:rPr>
+          <w:rStyle w:val="ExtensionTok"/>
+        </w:rPr>
+        <w:t xml:space="preserve">define</w:t>
+      </w:r>
+      <w:r>
+        <w:rPr>
+          <w:rStyle w:val="FunctionTok"/>
+        </w:rPr>
+        <w:t xml:space="preserve"> </w:t>
+      </w:r>
+      <w:r>
+        <w:rPr>
+          <w:rStyle w:val="OperatorTok"/>
+        </w:rPr>
+        <w:t xml:space="preserve">(</w:t>
+      </w:r>
+      <w:r>
+        <w:rPr>
+          <w:rStyle w:val="NormalTok"/>
+        </w:rPr>
+        <w:t xml:space="preserve">roots a b c</w:t>
+      </w:r>
+      <w:r>
+        <w:rPr>
+          <w:rStyle w:val="OperatorTok"/>
+        </w:rPr>
+        <w:t xml:space="preserve">)</w:t>
+      </w:r>
+      <w:r>
+        <w:br/>
+      </w:r>
+      <w:r>
+        <w:rPr>
+          <w:rStyle w:val="NormalTok"/>
+        </w:rPr>
+        <w:t xml:space="preserve">  </w:t>
+      </w:r>
+      <w:r>
+        <w:rPr>
+          <w:rStyle w:val="OperatorTok"/>
+        </w:rPr>
+        <w:t xml:space="preserve">(</w:t>
+      </w:r>
+      <w:r>
+        <w:rPr>
+          <w:rStyle w:val="KeywordTok"/>
+        </w:rPr>
+        <w:t xml:space="preserve">let</w:t>
+      </w:r>
+      <w:r>
+        <w:rPr>
+          <w:rStyle w:val="NormalTok"/>
+        </w:rPr>
+        <w:t xml:space="preserve"> </w:t>
+      </w:r>
+      <w:r>
+        <w:rPr>
+          <w:rStyle w:val="OperatorTok"/>
+        </w:rPr>
+        <w:t xml:space="preserve">([</w:t>
+      </w:r>
+      <w:r>
+        <w:rPr>
+          <w:rStyle w:val="NormalTok"/>
+        </w:rPr>
+        <w:t xml:space="preserve">s </w:t>
+      </w:r>
+      <w:r>
+        <w:rPr>
+          <w:rStyle w:val="OperatorTok"/>
+        </w:rPr>
+        <w:t xml:space="preserve">(</w:t>
+      </w:r>
+      <w:r>
+        <w:rPr>
+          <w:rStyle w:val="KeywordTok"/>
+        </w:rPr>
+        <w:t xml:space="preserve">sqrt</w:t>
+      </w:r>
+      <w:r>
+        <w:rPr>
+          <w:rStyle w:val="NormalTok"/>
+        </w:rPr>
+        <w:t xml:space="preserve"> </w:t>
+      </w:r>
+      <w:r>
+        <w:rPr>
+          <w:rStyle w:val="OperatorTok"/>
+        </w:rPr>
+        <w:t xml:space="preserve">(-</w:t>
+      </w:r>
+      <w:r>
+        <w:rPr>
+          <w:rStyle w:val="NormalTok"/>
+        </w:rPr>
+        <w:t xml:space="preserve"> </w:t>
+      </w:r>
+      <w:r>
+        <w:rPr>
+          <w:rStyle w:val="OperatorTok"/>
+        </w:rPr>
+        <w:t xml:space="preserve">(*</w:t>
+      </w:r>
+      <w:r>
+        <w:rPr>
+          <w:rStyle w:val="NormalTok"/>
+        </w:rPr>
+        <w:t xml:space="preserve"> b b</w:t>
+      </w:r>
+      <w:r>
+        <w:rPr>
+          <w:rStyle w:val="OperatorTok"/>
+        </w:rPr>
+        <w:t xml:space="preserve">)</w:t>
+      </w:r>
+      <w:r>
+        <w:rPr>
+          <w:rStyle w:val="NormalTok"/>
+        </w:rPr>
+        <w:t xml:space="preserve"> </w:t>
+      </w:r>
+      <w:r>
+        <w:rPr>
+          <w:rStyle w:val="OperatorTok"/>
+        </w:rPr>
+        <w:t xml:space="preserve">(*</w:t>
+      </w:r>
+      <w:r>
+        <w:rPr>
+          <w:rStyle w:val="NormalTok"/>
+        </w:rPr>
+        <w:t xml:space="preserve"> </w:t>
+      </w:r>
+      <w:r>
+        <w:rPr>
+          <w:rStyle w:val="DecValTok"/>
+        </w:rPr>
+        <w:t xml:space="preserve">4</w:t>
+      </w:r>
+      <w:r>
+        <w:rPr>
+          <w:rStyle w:val="NormalTok"/>
+        </w:rPr>
+        <w:t xml:space="preserve"> a c</w:t>
+      </w:r>
+      <w:r>
+        <w:rPr>
+          <w:rStyle w:val="OperatorTok"/>
+        </w:rPr>
+        <w:t xml:space="preserve">)))])</w:t>
+      </w:r>
+      <w:r>
+        <w:br/>
+      </w:r>
+      <w:r>
+        <w:rPr>
+          <w:rStyle w:val="NormalTok"/>
+        </w:rPr>
+        <w:t xml:space="preserve">    </w:t>
+      </w:r>
+      <w:r>
+        <w:rPr>
+          <w:rStyle w:val="OperatorTok"/>
+        </w:rPr>
+        <w:t xml:space="preserve">(</w:t>
+      </w:r>
+      <w:r>
+        <w:rPr>
+          <w:rStyle w:val="KeywordTok"/>
+        </w:rPr>
+        <w:t xml:space="preserve">list</w:t>
+      </w:r>
+      <w:r>
+        <w:rPr>
+          <w:rStyle w:val="NormalTok"/>
+        </w:rPr>
+        <w:t xml:space="preserve"> </w:t>
+      </w:r>
+      <w:r>
+        <w:rPr>
+          <w:rStyle w:val="OperatorTok"/>
+        </w:rPr>
+        <w:t xml:space="preserve">(/</w:t>
+      </w:r>
+      <w:r>
+        <w:rPr>
+          <w:rStyle w:val="NormalTok"/>
+        </w:rPr>
+        <w:t xml:space="preserve"> </w:t>
+      </w:r>
+      <w:r>
+        <w:rPr>
+          <w:rStyle w:val="OperatorTok"/>
+        </w:rPr>
+        <w:t xml:space="preserve">(+</w:t>
+      </w:r>
+      <w:r>
+        <w:rPr>
+          <w:rStyle w:val="NormalTok"/>
+        </w:rPr>
+        <w:t xml:space="preserve"> </w:t>
+      </w:r>
+      <w:r>
+        <w:rPr>
+          <w:rStyle w:val="OperatorTok"/>
+        </w:rPr>
+        <w:t xml:space="preserve">(-</w:t>
+      </w:r>
+      <w:r>
+        <w:rPr>
+          <w:rStyle w:val="NormalTok"/>
+        </w:rPr>
+        <w:t xml:space="preserve"> b</w:t>
+      </w:r>
+      <w:r>
+        <w:rPr>
+          <w:rStyle w:val="OperatorTok"/>
+        </w:rPr>
+        <w:t xml:space="preserve">)</w:t>
+      </w:r>
+      <w:r>
+        <w:rPr>
+          <w:rStyle w:val="NormalTok"/>
+        </w:rPr>
+        <w:t xml:space="preserve"> s</w:t>
+      </w:r>
+      <w:r>
+        <w:rPr>
+          <w:rStyle w:val="OperatorTok"/>
+        </w:rPr>
+        <w:t xml:space="preserve">)</w:t>
+      </w:r>
+      <w:r>
+        <w:rPr>
+          <w:rStyle w:val="NormalTok"/>
+        </w:rPr>
+        <w:t xml:space="preserve"> </w:t>
+      </w:r>
+      <w:r>
+        <w:rPr>
+          <w:rStyle w:val="OperatorTok"/>
+        </w:rPr>
+        <w:t xml:space="preserve">(*</w:t>
+      </w:r>
+      <w:r>
+        <w:rPr>
+          <w:rStyle w:val="NormalTok"/>
+        </w:rPr>
+        <w:t xml:space="preserve"> </w:t>
+      </w:r>
+      <w:r>
+        <w:rPr>
+          <w:rStyle w:val="DecValTok"/>
+        </w:rPr>
+        <w:t xml:space="preserve">2</w:t>
+      </w:r>
+      <w:r>
+        <w:rPr>
+          <w:rStyle w:val="NormalTok"/>
+        </w:rPr>
+        <w:t xml:space="preserve"> a</w:t>
+      </w:r>
+      <w:r>
+        <w:rPr>
+          <w:rStyle w:val="OperatorTok"/>
+        </w:rPr>
+        <w:t xml:space="preserve">))</w:t>
+      </w:r>
+      <w:r>
+        <w:br/>
+      </w:r>
+      <w:r>
+        <w:rPr>
+          <w:rStyle w:val="NormalTok"/>
+        </w:rPr>
+        <w:t xml:space="preserve">          </w:t>
+      </w:r>
+      <w:r>
+        <w:rPr>
+          <w:rStyle w:val="OperatorTok"/>
+        </w:rPr>
+        <w:t xml:space="preserve">(/</w:t>
+      </w:r>
+      <w:r>
+        <w:rPr>
+          <w:rStyle w:val="NormalTok"/>
+        </w:rPr>
+        <w:t xml:space="preserve"> </w:t>
+      </w:r>
+      <w:r>
+        <w:rPr>
+          <w:rStyle w:val="OperatorTok"/>
+        </w:rPr>
+        <w:t xml:space="preserve">(-</w:t>
+      </w:r>
+      <w:r>
+        <w:rPr>
+          <w:rStyle w:val="NormalTok"/>
+        </w:rPr>
+        <w:t xml:space="preserve"> </w:t>
+      </w:r>
+      <w:r>
+        <w:rPr>
+          <w:rStyle w:val="OperatorTok"/>
+        </w:rPr>
+        <w:t xml:space="preserve">(-</w:t>
+      </w:r>
+      <w:r>
+        <w:rPr>
+          <w:rStyle w:val="NormalTok"/>
+        </w:rPr>
+        <w:t xml:space="preserve"> b</w:t>
+      </w:r>
+      <w:r>
+        <w:rPr>
+          <w:rStyle w:val="OperatorTok"/>
+        </w:rPr>
+        <w:t xml:space="preserve">)</w:t>
+      </w:r>
+      <w:r>
+        <w:rPr>
+          <w:rStyle w:val="NormalTok"/>
+        </w:rPr>
+        <w:t xml:space="preserve"> s</w:t>
+      </w:r>
+      <w:r>
+        <w:rPr>
+          <w:rStyle w:val="OperatorTok"/>
+        </w:rPr>
+        <w:t xml:space="preserve">)</w:t>
+      </w:r>
+      <w:r>
+        <w:rPr>
+          <w:rStyle w:val="NormalTok"/>
+        </w:rPr>
+        <w:t xml:space="preserve"> </w:t>
+      </w:r>
+      <w:r>
+        <w:rPr>
+          <w:rStyle w:val="OperatorTok"/>
+        </w:rPr>
+        <w:t xml:space="preserve">(*</w:t>
+      </w:r>
+      <w:r>
+        <w:rPr>
+          <w:rStyle w:val="NormalTok"/>
+        </w:rPr>
+        <w:t xml:space="preserve"> </w:t>
+      </w:r>
+      <w:r>
+        <w:rPr>
+          <w:rStyle w:val="DecValTok"/>
+        </w:rPr>
+        <w:t xml:space="preserve">2</w:t>
+      </w:r>
+      <w:r>
+        <w:rPr>
+          <w:rStyle w:val="NormalTok"/>
+        </w:rPr>
+        <w:t xml:space="preserve"> a</w:t>
+      </w:r>
+      <w:r>
+        <w:rPr>
+          <w:rStyle w:val="OperatorTok"/>
+        </w:rPr>
+        <w:t xml:space="preserve">)))))</w:t>
+      </w:r>
+    </w:p>
+    <w:p>
+      <w:pPr>
+        <w:pStyle w:val="FirstParagraph"/>
+      </w:pPr>
+      <w:r>
+        <w:rPr>
+          <w:rStyle w:val="VerbatimChar"/>
+        </w:rPr>
+        <w:t xml:space="preserve">(roots 1 -3 2)</w:t>
+      </w:r>
+      <w:r>
+        <w:t xml:space="preserve"> </w:t>
+      </w:r>
+      <w:r>
+        <w:t xml:space="preserve">returns</w:t>
+      </w:r>
+      <w:r>
+        <w:t xml:space="preserve"> </w:t>
+      </w:r>
+      <w:r>
+        <w:rPr>
+          <w:rStyle w:val="VerbatimChar"/>
+        </w:rPr>
+        <w:t xml:space="preserve">'(2 1)</w:t>
+      </w:r>
+      <w:r>
+        <w:t xml:space="preserve">, since</w:t>
+      </w:r>
+      <w:r>
+        <w:t xml:space="preserve"> </w:t>
+      </w:r>
+      <m:oMath>
+        <m:sSup>
+          <m:e>
+            <m:r>
+              <m:t>x</m:t>
+            </m:r>
+          </m:e>
+          <m:sup>
+            <m:r>
+              <m:t>2</m:t>
+            </m:r>
+          </m:sup>
+        </m:sSup>
+        <m:r>
+          <m:rPr>
+            <m:sty m:val="p"/>
+          </m:rPr>
+          <m:t>−</m:t>
+        </m:r>
+        <m:r>
+          <m:t>3</m:t>
+        </m:r>
+        <m:r>
+          <m:t>x</m:t>
+        </m:r>
+        <m:r>
+          <m:rPr>
+            <m:sty m:val="p"/>
+          </m:rPr>
+          <m:t>+</m:t>
+        </m:r>
+        <m:r>
+          <m:t>2</m:t>
+        </m:r>
+        <m:r>
+          <m:rPr>
+            <m:sty m:val="p"/>
+          </m:rPr>
+          <m:t>=</m:t>
+        </m:r>
+        <m:r>
+          <m:rPr>
+            <m:sty m:val="p"/>
+          </m:rPr>
+          <m:t>(</m:t>
+        </m:r>
+        <m:r>
+          <m:t>x</m:t>
+        </m:r>
+        <m:r>
+          <m:rPr>
+            <m:sty m:val="p"/>
+          </m:rPr>
+          <m:t>−</m:t>
+        </m:r>
+        <m:r>
+          <m:t>1</m:t>
+        </m:r>
+        <m:r>
+          <m:rPr>
+            <m:sty m:val="p"/>
+          </m:rPr>
+          <m:t>)</m:t>
+        </m:r>
+        <m:r>
+          <m:rPr>
+            <m:sty m:val="p"/>
+          </m:rPr>
+          <m:t>(</m:t>
+        </m:r>
+        <m:r>
+          <m:t>x</m:t>
+        </m:r>
+        <m:r>
+          <m:rPr>
+            <m:sty m:val="p"/>
+          </m:rPr>
+          <m:t>−</m:t>
+        </m:r>
+        <m:r>
+          <m:t>2</m:t>
+        </m:r>
+        <m:r>
+          <m:rPr>
+            <m:sty m:val="p"/>
+          </m:rPr>
+          <m:t>)</m:t>
+        </m:r>
+      </m:oMath>
+      <w:r>
+        <w:t xml:space="preserve">.</w:t>
+      </w:r>
+    </w:p>
+    <w:p>
+      <w:pPr>
+        <w:pStyle w:val="BodyText"/>
+      </w:pPr>
+      <w:r>
+        <w:rPr>
+          <w:rStyle w:val="VerbatimChar"/>
+        </w:rPr>
+        <w:t xml:space="preserve">let</w:t>
+      </w:r>
+      <w:r>
+        <w:t xml:space="preserve"> </w:t>
+      </w:r>
+      <w:r>
+        <w:t xml:space="preserve">does not change a variable: inside the body,</w:t>
+      </w:r>
+      <w:r>
+        <w:t xml:space="preserve"> </w:t>
+      </w:r>
+      <w:r>
+        <w:rPr>
+          <w:rStyle w:val="VerbatimChar"/>
+        </w:rPr>
+        <w:t xml:space="preserve">s</w:t>
+      </w:r>
+      <w:r>
+        <w:t xml:space="preserve"> </w:t>
+      </w:r>
+      <w:r>
+        <w:t xml:space="preserve">stands for one value, as a name does in algebra.</w:t>
+      </w:r>
+      <w:r>
+        <w:t xml:space="preserve"> </w:t>
+      </w:r>
+      <w:r>
+        <w:t xml:space="preserve">So</w:t>
+      </w:r>
+      <w:r>
+        <w:t xml:space="preserve"> </w:t>
+      </w:r>
+      <w:r>
+        <w:rPr>
+          <w:rStyle w:val="VerbatimChar"/>
+        </w:rPr>
+        <w:t xml:space="preserve">roots</w:t>
+      </w:r>
+      <w:r>
+        <w:t xml:space="preserve"> </w:t>
+      </w:r>
+      <w:r>
+        <w:t xml:space="preserve">is a pure function (</w:t>
+      </w:r>
+      <w:hyperlink w:anchor="def-pure-function">
+        <w:r>
+          <w:rPr>
+            <w:rStyle w:val="Hyperlink"/>
+          </w:rPr>
+          <w:t xml:space="preserve">Definition 10</w:t>
+        </w:r>
+      </w:hyperlink>
+      <w:r>
+        <w:t xml:space="preserve">).</w:t>
+      </w:r>
+    </w:p>
+    <w:bookmarkEnd w:id="59"/>
+    <w:bookmarkStart w:id="61" w:name="rem-scheme-racket"/>
+    <w:p>
+      <w:pPr>
+        <w:pStyle w:val="BodyText"/>
+      </w:pPr>
       <w:r>
         <w:rPr>
           <w:i/>
           <w:iCs/>
         </w:rPr>
+        <w:t xml:space="preserve">Remark 5</w:t>
+      </w:r>
+      <w:r>
+        <w:t xml:space="preserve"> (Scheme and Racket). </w:t>
+      </w:r>
+      <w:r>
+        <w:t xml:space="preserve">Stanford’s CS 107,</w:t>
+      </w:r>
+      <w:r>
         <w:t xml:space="preserve"> </w:t>
       </w:r>
       <w:r>
@@ -8314,6 +10060,609 @@
           <w:i/>
           <w:iCs/>
         </w:rPr>
+        <w:t xml:space="preserve">Programming Paradigms</w:t>
+      </w:r>
+      <w:r>
+        <w:t xml:space="preserve">, taught Scheme in its Spring 2008 offering,</w:t>
+      </w:r>
+      <w:r>
+        <w:t xml:space="preserve"> </w:t>
+      </w:r>
+      <w:r>
+        <w:t xml:space="preserve">and its lectures are free to watch</w:t>
+      </w:r>
+      <w:r>
+        <w:t xml:space="preserve"> </w:t>
+      </w:r>
+      <w:r>
+        <w:t xml:space="preserve">(Cain 2008)</w:t>
+      </w:r>
+      <w:r>
+        <w:t xml:space="preserve">.</w:t>
+      </w:r>
+      <w:r>
+        <w:t xml:space="preserve"> </w:t>
+      </w:r>
+      <w:r>
+        <w:t xml:space="preserve">Racket grew out of Scheme,</w:t>
+      </w:r>
+      <w:r>
+        <w:t xml:space="preserve"> </w:t>
+      </w:r>
+      <w:r>
+        <w:t xml:space="preserve">and most of the Scheme code in those lectures runs in Racket with few changes:</w:t>
+      </w:r>
+    </w:p>
+    <w:p>
+      <w:pPr>
+        <w:pStyle w:val="Compact"/>
+        <w:numPr>
+          <w:ilvl w:val="0"/>
+          <w:numId w:val="1020"/>
+        </w:numPr>
+      </w:pPr>
+      <w:r>
+        <w:t xml:space="preserve">Scheme’s</w:t>
+      </w:r>
+      <w:r>
+        <w:t xml:space="preserve"> </w:t>
+      </w:r>
+      <w:r>
+        <w:rPr>
+          <w:rStyle w:val="VerbatimChar"/>
+        </w:rPr>
+        <w:t xml:space="preserve">car</w:t>
+      </w:r>
+      <w:r>
+        <w:t xml:space="preserve"> </w:t>
+      </w:r>
+      <w:r>
+        <w:t xml:space="preserve">and</w:t>
+      </w:r>
+      <w:r>
+        <w:t xml:space="preserve"> </w:t>
+      </w:r>
+      <w:r>
+        <w:rPr>
+          <w:rStyle w:val="VerbatimChar"/>
+        </w:rPr>
+        <w:t xml:space="preserve">cdr</w:t>
+      </w:r>
+      <w:r>
+        <w:t xml:space="preserve"> </w:t>
+      </w:r>
+      <w:r>
+        <w:t xml:space="preserve">return the first element of a list and the list of the other elements.</w:t>
+      </w:r>
+      <w:r>
+        <w:t xml:space="preserve"> </w:t>
+      </w:r>
+      <w:r>
+        <w:t xml:space="preserve">Racket accepts them too,</w:t>
+      </w:r>
+      <w:r>
+        <w:t xml:space="preserve"> </w:t>
+      </w:r>
+      <w:r>
+        <w:t xml:space="preserve">but this course uses their clearer names</w:t>
+      </w:r>
+      <w:r>
+        <w:t xml:space="preserve"> </w:t>
+      </w:r>
+      <w:r>
+        <w:rPr>
+          <w:rStyle w:val="VerbatimChar"/>
+        </w:rPr>
+        <w:t xml:space="preserve">first</w:t>
+      </w:r>
+      <w:r>
+        <w:t xml:space="preserve"> </w:t>
+      </w:r>
+      <w:r>
+        <w:t xml:space="preserve">and</w:t>
+      </w:r>
+      <w:r>
+        <w:t xml:space="preserve"> </w:t>
+      </w:r>
+      <w:r>
+        <w:rPr>
+          <w:rStyle w:val="VerbatimChar"/>
+        </w:rPr>
+        <w:t xml:space="preserve">rest</w:t>
+      </w:r>
+      <w:r>
+        <w:t xml:space="preserve">.</w:t>
+      </w:r>
+    </w:p>
+    <w:p>
+      <w:pPr>
+        <w:pStyle w:val="Compact"/>
+        <w:numPr>
+          <w:ilvl w:val="0"/>
+          <w:numId w:val="1020"/>
+        </w:numPr>
+      </w:pPr>
+      <w:r>
+        <w:t xml:space="preserve">A Scheme file needs no first line.</w:t>
+      </w:r>
+      <w:r>
+        <w:t xml:space="preserve"> </w:t>
+      </w:r>
+      <w:r>
+        <w:t xml:space="preserve">A Racket file starts with</w:t>
+      </w:r>
+      <w:r>
+        <w:t xml:space="preserve"> </w:t>
+      </w:r>
+      <w:r>
+        <w:rPr>
+          <w:rStyle w:val="VerbatimChar"/>
+        </w:rPr>
+        <w:t xml:space="preserve">#lang racket</w:t>
+      </w:r>
+      <w:r>
+        <w:t xml:space="preserve">.</w:t>
+      </w:r>
+    </w:p>
+    <w:p>
+      <w:pPr>
+        <w:pStyle w:val="Compact"/>
+        <w:numPr>
+          <w:ilvl w:val="0"/>
+          <w:numId w:val="1020"/>
+        </w:numPr>
+      </w:pPr>
+      <w:r>
+        <w:t xml:space="preserve">Racket writes the cases of a</w:t>
+      </w:r>
+      <w:r>
+        <w:t xml:space="preserve"> </w:t>
+      </w:r>
+      <w:r>
+        <w:rPr>
+          <w:rStyle w:val="VerbatimChar"/>
+        </w:rPr>
+        <w:t xml:space="preserve">cond</w:t>
+      </w:r>
+      <w:r>
+        <w:t xml:space="preserve"> </w:t>
+      </w:r>
+      <w:r>
+        <w:t xml:space="preserve">in square brackets,</w:t>
+      </w:r>
+      <w:r>
+        <w:t xml:space="preserve"> </w:t>
+      </w:r>
+      <w:r>
+        <w:rPr>
+          <w:rStyle w:val="VerbatimChar"/>
+        </w:rPr>
+        <w:t xml:space="preserve">[test a]</w:t>
+      </w:r>
+      <w:r>
+        <w:t xml:space="preserve">,</w:t>
+      </w:r>
+      <w:r>
+        <w:t xml:space="preserve"> </w:t>
+      </w:r>
+      <w:r>
+        <w:t xml:space="preserve">where Scheme uses parentheses.</w:t>
+      </w:r>
+      <w:r>
+        <w:t xml:space="preserve"> </w:t>
+      </w:r>
+      <w:r>
+        <w:t xml:space="preserve">Racket accepts both.</w:t>
+      </w:r>
+    </w:p>
+    <w:p>
+      <w:pPr>
+        <w:pStyle w:val="Compact"/>
+        <w:numPr>
+          <w:ilvl w:val="0"/>
+          <w:numId w:val="1020"/>
+        </w:numPr>
+      </w:pPr>
+      <w:r>
+        <w:t xml:space="preserve">CS 107 typed its code into an interpreter called Kawa.</w:t>
+      </w:r>
+      <w:r>
+        <w:t xml:space="preserve"> </w:t>
+      </w:r>
+      <w:r>
+        <w:t xml:space="preserve">This course uses DrRacket.</w:t>
+      </w:r>
+    </w:p>
+    <w:p>
+      <w:pPr>
+        <w:pStyle w:val="FirstParagraph"/>
+      </w:pPr>
+      <w:r>
+        <w:rPr>
+          <w:i/>
+          <w:iCs/>
+        </w:rPr>
+        <w:t xml:space="preserve">Video:</w:t>
+      </w:r>
+      <w:r>
+        <w:t xml:space="preserve"> </w:t>
+      </w:r>
+      <w:r>
+        <w:t xml:space="preserve">Jerry Cain introduces Scheme, its lists and its first recursive functions in</w:t>
+      </w:r>
+      <w:r>
+        <w:t xml:space="preserve"> </w:t>
+      </w:r>
+      <w:hyperlink r:id="rId60">
+        <w:r>
+          <w:rPr>
+            <w:rStyle w:val="Hyperlink"/>
+          </w:rPr>
+          <w:t xml:space="preserve">CS 107 Lecture 19</w:t>
+        </w:r>
+      </w:hyperlink>
+      <w:r>
+        <w:t xml:space="preserve"> </w:t>
+      </w:r>
+      <w:r>
+        <w:t xml:space="preserve">(Cain 2008)</w:t>
+      </w:r>
+      <w:r>
+        <w:t xml:space="preserve">.</w:t>
+      </w:r>
+    </w:p>
+    <w:bookmarkEnd w:id="61"/>
+    <w:bookmarkStart w:id="66" w:name="rem-functional-further-reading"/>
+    <w:p>
+      <w:pPr>
+        <w:pStyle w:val="BodyText"/>
+      </w:pPr>
+      <w:r>
+        <w:rPr>
+          <w:i/>
+          <w:iCs/>
+        </w:rPr>
+        <w:t xml:space="preserve">Remark 6</w:t>
+      </w:r>
+      <w:r>
+        <w:t xml:space="preserve"> (Further reading). </w:t>
+      </w:r>
+    </w:p>
+    <w:p>
+      <w:pPr>
+        <w:pStyle w:val="Compact"/>
+        <w:numPr>
+          <w:ilvl w:val="0"/>
+          <w:numId w:val="1021"/>
+        </w:numPr>
+      </w:pPr>
+      <w:r>
+        <w:t xml:space="preserve">Jerry Cain’s CS 107 handouts on Scheme, on the</w:t>
+      </w:r>
+      <w:r>
+        <w:t xml:space="preserve"> </w:t>
+      </w:r>
+      <w:hyperlink r:id="rId62">
+        <w:r>
+          <w:rPr>
+            <w:rStyle w:val="Hyperlink"/>
+          </w:rPr>
+          <w:t xml:space="preserve">course page</w:t>
+        </w:r>
+      </w:hyperlink>
+      <w:r>
+        <w:t xml:space="preserve">,</w:t>
+      </w:r>
+      <w:r>
+        <w:t xml:space="preserve"> </w:t>
+      </w:r>
+      <w:r>
+        <w:t xml:space="preserve">work many more examples, among them flattening nested lists and listing permutations;</w:t>
+      </w:r>
+      <w:r>
+        <w:t xml:space="preserve"> </w:t>
+      </w:r>
+      <w:r>
+        <w:t xml:space="preserve">his lectures 19 to 23</w:t>
+      </w:r>
+      <w:r>
+        <w:t xml:space="preserve"> </w:t>
+      </w:r>
+      <w:r>
+        <w:t xml:space="preserve">(Cain 2008)</w:t>
+      </w:r>
+      <w:r>
+        <w:t xml:space="preserve"> </w:t>
+      </w:r>
+      <w:r>
+        <w:t xml:space="preserve">cover the same ground.</w:t>
+      </w:r>
+    </w:p>
+    <w:p>
+      <w:pPr>
+        <w:pStyle w:val="Compact"/>
+        <w:numPr>
+          <w:ilvl w:val="0"/>
+          <w:numId w:val="1021"/>
+        </w:numPr>
+      </w:pPr>
+      <w:r>
+        <w:t xml:space="preserve">Will Crichton’s CS 242 notes on</w:t>
+      </w:r>
+      <w:r>
+        <w:t xml:space="preserve"> </w:t>
+      </w:r>
+      <w:hyperlink r:id="rId63">
+        <w:r>
+          <w:rPr>
+            <w:rStyle w:val="Hyperlink"/>
+          </w:rPr>
+          <w:t xml:space="preserve">functional basics</w:t>
+        </w:r>
+      </w:hyperlink>
+      <w:r>
+        <w:t xml:space="preserve"> </w:t>
+      </w:r>
+      <w:r>
+        <w:t xml:space="preserve">and</w:t>
+      </w:r>
+      <w:r>
+        <w:t xml:space="preserve"> </w:t>
+      </w:r>
+      <w:hyperlink r:id="rId64">
+        <w:r>
+          <w:rPr>
+            <w:rStyle w:val="Hyperlink"/>
+          </w:rPr>
+          <w:t xml:space="preserve">algebraic data types</w:t>
+        </w:r>
+      </w:hyperlink>
+      <w:r>
+        <w:t xml:space="preserve"> </w:t>
+      </w:r>
+      <w:r>
+        <w:t xml:space="preserve">build functional programs on types, in the language OCaml</w:t>
+      </w:r>
+      <w:r>
+        <w:t xml:space="preserve"> </w:t>
+      </w:r>
+      <w:r>
+        <w:t xml:space="preserve">(Crichton 2019)</w:t>
+      </w:r>
+      <w:r>
+        <w:t xml:space="preserve">.</w:t>
+      </w:r>
+    </w:p>
+    <w:p>
+      <w:pPr>
+        <w:pStyle w:val="Compact"/>
+        <w:numPr>
+          <w:ilvl w:val="0"/>
+          <w:numId w:val="1021"/>
+        </w:numPr>
+      </w:pPr>
+      <w:r>
+        <w:t xml:space="preserve">Stanford’s</w:t>
+      </w:r>
+      <w:r>
+        <w:t xml:space="preserve"> </w:t>
+      </w:r>
+      <w:hyperlink r:id="rId65">
+        <w:r>
+          <w:rPr>
+            <w:rStyle w:val="Hyperlink"/>
+          </w:rPr>
+          <w:t xml:space="preserve">CS 99</w:t>
+        </w:r>
+      </w:hyperlink>
+      <w:r>
+        <w:t xml:space="preserve"> </w:t>
+      </w:r>
+      <w:r>
+        <w:t xml:space="preserve">teaches Lean 4,</w:t>
+      </w:r>
+      <w:r>
+        <w:t xml:space="preserve"> </w:t>
+      </w:r>
+      <w:r>
+        <w:t xml:space="preserve">a functional programming language in which a computer checks proofs about the programs</w:t>
+      </w:r>
+      <w:r>
+        <w:t xml:space="preserve"> </w:t>
+      </w:r>
+      <w:r>
+        <w:t xml:space="preserve">(Aniva and Mohamed 2025)</w:t>
+      </w:r>
+      <w:r>
+        <w:t xml:space="preserve">.</w:t>
+      </w:r>
+    </w:p>
+    <w:bookmarkEnd w:id="66"/>
+    <w:bookmarkEnd w:id="67"/>
+    <w:bookmarkStart w:id="83" w:name="references"/>
+    <w:p>
+      <w:pPr>
+        <w:pStyle w:val="Heading1"/>
+      </w:pPr>
+      <w:r>
+        <w:t xml:space="preserve">References</w:t>
+      </w:r>
+    </w:p>
+    <w:bookmarkStart w:id="82" w:name="refs"/>
+    <w:bookmarkStart w:id="68" w:name="ref-aniva2025cs99"/>
+    <w:p>
+      <w:pPr>
+        <w:pStyle w:val="Bibliography"/>
+      </w:pPr>
+      <w:r>
+        <w:t xml:space="preserve">Aniva, Leni, and Abdalrhman Mohamed. 2025.</w:t>
+      </w:r>
+      <w:r>
+        <w:t xml:space="preserve"> </w:t>
+      </w:r>
+      <w:r>
+        <w:rPr>
+          <w:i/>
+          <w:iCs/>
+        </w:rPr>
+        <w:t xml:space="preserve">CS</w:t>
+      </w:r>
+      <w:r>
+        <w:rPr>
+          <w:i/>
+          <w:iCs/>
+        </w:rPr>
+        <w:t xml:space="preserve"> </w:t>
+      </w:r>
+      <w:r>
+        <w:rPr>
+          <w:i/>
+          <w:iCs/>
+        </w:rPr>
+        <w:t xml:space="preserve">99: Functional Programming and Theorem Proving in</w:t>
+      </w:r>
+      <w:r>
+        <w:rPr>
+          <w:i/>
+          <w:iCs/>
+        </w:rPr>
+        <w:t xml:space="preserve"> </w:t>
+      </w:r>
+      <w:r>
+        <w:rPr>
+          <w:i/>
+          <w:iCs/>
+        </w:rPr>
+        <w:t xml:space="preserve">Lean</w:t>
+      </w:r>
+      <w:r>
+        <w:rPr>
+          <w:i/>
+          <w:iCs/>
+        </w:rPr>
+        <w:t xml:space="preserve"> </w:t>
+      </w:r>
+      <w:r>
+        <w:rPr>
+          <w:i/>
+          <w:iCs/>
+        </w:rPr>
+        <w:t xml:space="preserve">4</w:t>
+      </w:r>
+      <w:r>
+        <w:t xml:space="preserve">. Stanford University.</w:t>
+      </w:r>
+      <w:r>
+        <w:t xml:space="preserve"> </w:t>
+      </w:r>
+      <w:hyperlink r:id="rId65">
+        <w:r>
+          <w:rPr>
+            <w:rStyle w:val="Hyperlink"/>
+          </w:rPr>
+          <w:t xml:space="preserve">https://web.stanford.edu/class/cs99/</w:t>
+        </w:r>
+      </w:hyperlink>
+      <w:r>
+        <w:t xml:space="preserve">.</w:t>
+      </w:r>
+    </w:p>
+    <w:bookmarkEnd w:id="68"/>
+    <w:bookmarkStart w:id="69" w:name="ref-cain2008cs107videos"/>
+    <w:p>
+      <w:pPr>
+        <w:pStyle w:val="Bibliography"/>
+      </w:pPr>
+      <w:r>
+        <w:t xml:space="preserve">Cain, Jerry. 2008.</w:t>
+      </w:r>
+      <w:r>
+        <w:t xml:space="preserve"> </w:t>
+      </w:r>
+      <w:r>
+        <w:rPr>
+          <w:i/>
+          <w:iCs/>
+        </w:rPr>
+        <w:t xml:space="preserve">Programming Paradigms (</w:t>
+      </w:r>
+      <w:r>
+        <w:rPr>
+          <w:i/>
+          <w:iCs/>
+        </w:rPr>
+        <w:t xml:space="preserve">Stanford</w:t>
+      </w:r>
+      <w:r>
+        <w:rPr>
+          <w:i/>
+          <w:iCs/>
+        </w:rPr>
+        <w:t xml:space="preserve"> </w:t>
+      </w:r>
+      <w:r>
+        <w:rPr>
+          <w:i/>
+          <w:iCs/>
+        </w:rPr>
+        <w:t xml:space="preserve">CS107</w:t>
+      </w:r>
+      <w:r>
+        <w:rPr>
+          <w:i/>
+          <w:iCs/>
+        </w:rPr>
+        <w:t xml:space="preserve">), Lectures 19–23</w:t>
+      </w:r>
+      <w:r>
+        <w:t xml:space="preserve">. Stanford Engineering Everywhere.</w:t>
+      </w:r>
+      <w:r>
+        <w:t xml:space="preserve"> </w:t>
+      </w:r>
+      <w:hyperlink r:id="rId62">
+        <w:r>
+          <w:rPr>
+            <w:rStyle w:val="Hyperlink"/>
+          </w:rPr>
+          <w:t xml:space="preserve">https://see.stanford.edu/Course/CS107</w:t>
+        </w:r>
+      </w:hyperlink>
+      <w:r>
+        <w:t xml:space="preserve">.</w:t>
+      </w:r>
+    </w:p>
+    <w:bookmarkEnd w:id="69"/>
+    <w:bookmarkStart w:id="71" w:name="ref-crichton2019cs242"/>
+    <w:p>
+      <w:pPr>
+        <w:pStyle w:val="Bibliography"/>
+      </w:pPr>
+      <w:r>
+        <w:t xml:space="preserve">Crichton, Will. 2019.</w:t>
+      </w:r>
+      <w:r>
+        <w:t xml:space="preserve"> </w:t>
+      </w:r>
+      <w:r>
+        <w:rPr>
+          <w:i/>
+          <w:iCs/>
+        </w:rPr>
+        <w:t xml:space="preserve">CS</w:t>
+      </w:r>
+      <w:r>
+        <w:rPr>
+          <w:i/>
+          <w:iCs/>
+        </w:rPr>
+        <w:t xml:space="preserve"> </w:t>
+      </w:r>
+      <w:r>
+        <w:rPr>
+          <w:i/>
+          <w:iCs/>
+        </w:rPr>
         <w:t xml:space="preserve">242: Programming Languages, Fall 2019</w:t>
       </w:r>
       <w:r>
@@ -8322,7 +10671,7 @@
       <w:r>
         <w:t xml:space="preserve"> </w:t>
       </w:r>
-      <w:hyperlink r:id="rId58">
+      <w:hyperlink r:id="rId70">
         <w:r>
           <w:rPr>
             <w:rStyle w:val="Hyperlink"/>
@@ -8334,8 +10683,8 @@
         <w:t xml:space="preserve">.</w:t>
       </w:r>
     </w:p>
-    <w:bookmarkEnd w:id="59"/>
-    <w:bookmarkStart w:id="61" w:name="ref-wikipedia_expression_mathematics"/>
+    <w:bookmarkEnd w:id="71"/>
+    <w:bookmarkStart w:id="73" w:name="ref-wikipedia_expression_mathematics"/>
     <w:p>
       <w:pPr>
         <w:pStyle w:val="Bibliography"/>
@@ -8394,7 +10743,7 @@
       <w:r>
         <w:t xml:space="preserve"> </w:t>
       </w:r>
-      <w:hyperlink r:id="rId60">
+      <w:hyperlink r:id="rId72">
         <w:r>
           <w:rPr>
             <w:rStyle w:val="Hyperlink"/>
@@ -8406,8 +10755,8 @@
         <w:t xml:space="preserve">.</w:t>
       </w:r>
     </w:p>
-    <w:bookmarkEnd w:id="61"/>
-    <w:bookmarkStart w:id="63" w:name="ref-wikipedia_function_mathematics"/>
+    <w:bookmarkEnd w:id="73"/>
+    <w:bookmarkStart w:id="75" w:name="ref-wikipedia_function_mathematics"/>
     <w:p>
       <w:pPr>
         <w:pStyle w:val="Bibliography"/>
@@ -8466,7 +10815,7 @@
       <w:r>
         <w:t xml:space="preserve"> </w:t>
       </w:r>
-      <w:hyperlink r:id="rId62">
+      <w:hyperlink r:id="rId74">
         <w:r>
           <w:rPr>
             <w:rStyle w:val="Hyperlink"/>
@@ -8478,8 +10827,8 @@
         <w:t xml:space="preserve">.</w:t>
       </w:r>
     </w:p>
-    <w:bookmarkEnd w:id="63"/>
-    <w:bookmarkStart w:id="65" w:name="ref-wikipedia_functional_programming"/>
+    <w:bookmarkEnd w:id="75"/>
+    <w:bookmarkStart w:id="77" w:name="ref-wikipedia_functional_programming"/>
     <w:p>
       <w:pPr>
         <w:pStyle w:val="Bibliography"/>
@@ -8538,7 +10887,7 @@
       <w:r>
         <w:t xml:space="preserve"> </w:t>
       </w:r>
-      <w:hyperlink r:id="rId64">
+      <w:hyperlink r:id="rId76">
         <w:r>
           <w:rPr>
             <w:rStyle w:val="Hyperlink"/>
@@ -8550,8 +10899,8 @@
         <w:t xml:space="preserve">.</w:t>
       </w:r>
     </w:p>
-    <w:bookmarkEnd w:id="65"/>
-    <w:bookmarkStart w:id="67" w:name="ref-wikipedia_higher_order_function"/>
+    <w:bookmarkEnd w:id="77"/>
+    <w:bookmarkStart w:id="79" w:name="ref-wikipedia_higher_order_function"/>
     <w:p>
       <w:pPr>
         <w:pStyle w:val="Bibliography"/>
@@ -8610,7 +10959,7 @@
       <w:r>
         <w:t xml:space="preserve"> </w:t>
       </w:r>
-      <w:hyperlink r:id="rId66">
+      <w:hyperlink r:id="rId78">
         <w:r>
           <w:rPr>
             <w:rStyle w:val="Hyperlink"/>
@@ -8622,8 +10971,8 @@
         <w:t xml:space="preserve">.</w:t>
       </w:r>
     </w:p>
-    <w:bookmarkEnd w:id="67"/>
-    <w:bookmarkStart w:id="69" w:name="ref-wikipedia_pure_function"/>
+    <w:bookmarkEnd w:id="79"/>
+    <w:bookmarkStart w:id="81" w:name="ref-wikipedia_pure_function"/>
     <w:p>
       <w:pPr>
         <w:pStyle w:val="Bibliography"/>
@@ -8682,7 +11031,7 @@
       <w:r>
         <w:t xml:space="preserve"> </w:t>
       </w:r>
-      <w:hyperlink r:id="rId68">
+      <w:hyperlink r:id="rId80">
         <w:r>
           <w:rPr>
             <w:rStyle w:val="Hyperlink"/>
@@ -8694,9 +11043,9 @@
         <w:t xml:space="preserve">.</w:t>
       </w:r>
     </w:p>
-    <w:bookmarkEnd w:id="69"/>
-    <w:bookmarkEnd w:id="70"/>
-    <w:bookmarkEnd w:id="71"/>
+    <w:bookmarkEnd w:id="81"/>
+    <w:bookmarkEnd w:id="82"/>
+    <w:bookmarkEnd w:id="83"/>
     <w:sectPr>
       <w:footnotePr>
         <w:numRestart w:val="eachSect"/>
@@ -9371,6 +11720,72 @@
     </w:lvlOverride>
   </w:num>
   <w:num w:numId="1017">
+    <w:abstractNumId w:val="99411"/>
+    <w:lvlOverride w:ilvl="0">
+      <w:startOverride w:val="1"/>
+    </w:lvlOverride>
+    <w:lvlOverride w:ilvl="1">
+      <w:startOverride w:val="1"/>
+    </w:lvlOverride>
+    <w:lvlOverride w:ilvl="2">
+      <w:startOverride w:val="1"/>
+    </w:lvlOverride>
+    <w:lvlOverride w:ilvl="3">
+      <w:startOverride w:val="1"/>
+    </w:lvlOverride>
+    <w:lvlOverride w:ilvl="4">
+      <w:startOverride w:val="1"/>
+    </w:lvlOverride>
+    <w:lvlOverride w:ilvl="5">
+      <w:startOverride w:val="1"/>
+    </w:lvlOverride>
+    <w:lvlOverride w:ilvl="6">
+      <w:startOverride w:val="1"/>
+    </w:lvlOverride>
+    <w:lvlOverride w:ilvl="7">
+      <w:startOverride w:val="1"/>
+    </w:lvlOverride>
+    <w:lvlOverride w:ilvl="8">
+      <w:startOverride w:val="1"/>
+    </w:lvlOverride>
+  </w:num>
+  <w:num w:numId="1018">
+    <w:abstractNumId w:val="99411"/>
+    <w:lvlOverride w:ilvl="0">
+      <w:startOverride w:val="1"/>
+    </w:lvlOverride>
+    <w:lvlOverride w:ilvl="1">
+      <w:startOverride w:val="1"/>
+    </w:lvlOverride>
+    <w:lvlOverride w:ilvl="2">
+      <w:startOverride w:val="1"/>
+    </w:lvlOverride>
+    <w:lvlOverride w:ilvl="3">
+      <w:startOverride w:val="1"/>
+    </w:lvlOverride>
+    <w:lvlOverride w:ilvl="4">
+      <w:startOverride w:val="1"/>
+    </w:lvlOverride>
+    <w:lvlOverride w:ilvl="5">
+      <w:startOverride w:val="1"/>
+    </w:lvlOverride>
+    <w:lvlOverride w:ilvl="6">
+      <w:startOverride w:val="1"/>
+    </w:lvlOverride>
+    <w:lvlOverride w:ilvl="7">
+      <w:startOverride w:val="1"/>
+    </w:lvlOverride>
+    <w:lvlOverride w:ilvl="8">
+      <w:startOverride w:val="1"/>
+    </w:lvlOverride>
+  </w:num>
+  <w:num w:numId="1019">
+    <w:abstractNumId w:val="991"/>
+  </w:num>
+  <w:num w:numId="1020">
+    <w:abstractNumId w:val="991"/>
+  </w:num>
+  <w:num w:numId="1021">
     <w:abstractNumId w:val="991"/>
   </w:num>
 </w:numbering>

</xml_diff>